<commit_message>
Update SIRE_InterimReport03_v1_0.docx with backend testing sections and updated summary
Co-authored-by: Anaxagorius <188515693+Anaxagorius@users.noreply.github.com>
Agent-Logs-Url: https://github.com/Anaxagorius/S.I.R.E./sessions/7ea64ddf-417d-4bf4-80c7-0b8d5141b9c6
</commit_message>
<xml_diff>
--- a/SIRE_InterimReport03_v1_0.docx
+++ b/SIRE_InterimReport03_v1_0.docx
@@ -914,7 +914,7 @@
             <w:rPr>
               <w:noProof w:val="0"/>
             </w:rPr>
-            <w:fldChar w:fldCharType="begin"/>
+            <w:fldChar w:fldCharType="begin" w:dirty="1"/>
           </w:r>
           <w:r>
             <w:instrText xml:space="preserve"> TOC \o "1-3" \h \z \u </w:instrText>
@@ -942,7 +942,7 @@
               <w:rPr>
                 <w:webHidden/>
               </w:rPr>
-              <w:fldChar w:fldCharType="begin"/>
+              <w:fldChar w:fldCharType="begin" w:dirty="1"/>
             </w:r>
             <w:r>
               <w:rPr>
@@ -1019,7 +1019,7 @@
                 <w:noProof/>
                 <w:webHidden/>
               </w:rPr>
-              <w:fldChar w:fldCharType="begin"/>
+              <w:fldChar w:fldCharType="begin" w:dirty="1"/>
             </w:r>
             <w:r>
               <w:rPr>
@@ -1111,7 +1111,7 @@
                 <w:noProof/>
                 <w:webHidden/>
               </w:rPr>
-              <w:fldChar w:fldCharType="begin"/>
+              <w:fldChar w:fldCharType="begin" w:dirty="1"/>
             </w:r>
             <w:r>
               <w:rPr>
@@ -1201,7 +1201,7 @@
                 <w:noProof/>
                 <w:webHidden/>
               </w:rPr>
-              <w:fldChar w:fldCharType="begin"/>
+              <w:fldChar w:fldCharType="begin" w:dirty="1"/>
             </w:r>
             <w:r>
               <w:rPr>
@@ -1280,7 +1280,7 @@
               <w:rPr>
                 <w:webHidden/>
               </w:rPr>
-              <w:fldChar w:fldCharType="begin"/>
+              <w:fldChar w:fldCharType="begin" w:dirty="1"/>
             </w:r>
             <w:r>
               <w:rPr>
@@ -1351,7 +1351,7 @@
                 <w:noProof/>
                 <w:webHidden/>
               </w:rPr>
-              <w:fldChar w:fldCharType="begin"/>
+              <w:fldChar w:fldCharType="begin" w:dirty="1"/>
             </w:r>
             <w:r>
               <w:rPr>
@@ -1427,7 +1427,7 @@
                 <w:noProof/>
                 <w:webHidden/>
               </w:rPr>
-              <w:fldChar w:fldCharType="begin"/>
+              <w:fldChar w:fldCharType="begin" w:dirty="1"/>
             </w:r>
             <w:r>
               <w:rPr>
@@ -1501,7 +1501,7 @@
                 <w:noProof/>
                 <w:webHidden/>
               </w:rPr>
-              <w:fldChar w:fldCharType="begin"/>
+              <w:fldChar w:fldCharType="begin" w:dirty="1"/>
             </w:r>
             <w:r>
               <w:rPr>
@@ -1575,7 +1575,7 @@
                 <w:noProof/>
                 <w:webHidden/>
               </w:rPr>
-              <w:fldChar w:fldCharType="begin"/>
+              <w:fldChar w:fldCharType="begin" w:dirty="1"/>
             </w:r>
             <w:r>
               <w:rPr>
@@ -1649,7 +1649,7 @@
                 <w:noProof/>
                 <w:webHidden/>
               </w:rPr>
-              <w:fldChar w:fldCharType="begin"/>
+              <w:fldChar w:fldCharType="begin" w:dirty="1"/>
             </w:r>
             <w:r>
               <w:rPr>
@@ -1725,7 +1725,7 @@
                 <w:noProof/>
                 <w:webHidden/>
               </w:rPr>
-              <w:fldChar w:fldCharType="begin"/>
+              <w:fldChar w:fldCharType="begin" w:dirty="1"/>
             </w:r>
             <w:r>
               <w:rPr>
@@ -1799,7 +1799,7 @@
                 <w:noProof/>
                 <w:webHidden/>
               </w:rPr>
-              <w:fldChar w:fldCharType="begin"/>
+              <w:fldChar w:fldCharType="begin" w:dirty="1"/>
             </w:r>
             <w:r>
               <w:rPr>
@@ -1873,7 +1873,7 @@
                 <w:noProof/>
                 <w:webHidden/>
               </w:rPr>
-              <w:fldChar w:fldCharType="begin"/>
+              <w:fldChar w:fldCharType="begin" w:dirty="1"/>
             </w:r>
             <w:r>
               <w:rPr>
@@ -1947,7 +1947,7 @@
                 <w:noProof/>
                 <w:webHidden/>
               </w:rPr>
-              <w:fldChar w:fldCharType="begin"/>
+              <w:fldChar w:fldCharType="begin" w:dirty="1"/>
             </w:r>
             <w:r>
               <w:rPr>
@@ -2021,7 +2021,7 @@
                 <w:noProof/>
                 <w:webHidden/>
               </w:rPr>
-              <w:fldChar w:fldCharType="begin"/>
+              <w:fldChar w:fldCharType="begin" w:dirty="1"/>
             </w:r>
             <w:r>
               <w:rPr>
@@ -2095,7 +2095,7 @@
                 <w:noProof/>
                 <w:webHidden/>
               </w:rPr>
-              <w:fldChar w:fldCharType="begin"/>
+              <w:fldChar w:fldCharType="begin" w:dirty="1"/>
             </w:r>
             <w:r>
               <w:rPr>
@@ -2169,7 +2169,7 @@
                 <w:noProof/>
                 <w:webHidden/>
               </w:rPr>
-              <w:fldChar w:fldCharType="begin"/>
+              <w:fldChar w:fldCharType="begin" w:dirty="1"/>
             </w:r>
             <w:r>
               <w:rPr>
@@ -2243,7 +2243,7 @@
                 <w:noProof/>
                 <w:webHidden/>
               </w:rPr>
-              <w:fldChar w:fldCharType="begin"/>
+              <w:fldChar w:fldCharType="begin" w:dirty="1"/>
             </w:r>
             <w:r>
               <w:rPr>
@@ -2319,7 +2319,7 @@
                 <w:noProof/>
                 <w:webHidden/>
               </w:rPr>
-              <w:fldChar w:fldCharType="begin"/>
+              <w:fldChar w:fldCharType="begin" w:dirty="1"/>
             </w:r>
             <w:r>
               <w:rPr>
@@ -2393,7 +2393,7 @@
                 <w:noProof/>
                 <w:webHidden/>
               </w:rPr>
-              <w:fldChar w:fldCharType="begin"/>
+              <w:fldChar w:fldCharType="begin" w:dirty="1"/>
             </w:r>
             <w:r>
               <w:rPr>
@@ -2467,7 +2467,7 @@
                 <w:noProof/>
                 <w:webHidden/>
               </w:rPr>
-              <w:fldChar w:fldCharType="begin"/>
+              <w:fldChar w:fldCharType="begin" w:dirty="1"/>
             </w:r>
             <w:r>
               <w:rPr>
@@ -2543,7 +2543,7 @@
                 <w:noProof/>
                 <w:webHidden/>
               </w:rPr>
-              <w:fldChar w:fldCharType="begin"/>
+              <w:fldChar w:fldCharType="begin" w:dirty="1"/>
             </w:r>
             <w:r>
               <w:rPr>
@@ -2617,7 +2617,7 @@
                 <w:noProof/>
                 <w:webHidden/>
               </w:rPr>
-              <w:fldChar w:fldCharType="begin"/>
+              <w:fldChar w:fldCharType="begin" w:dirty="1"/>
             </w:r>
             <w:r>
               <w:rPr>
@@ -2691,7 +2691,7 @@
                 <w:noProof/>
                 <w:webHidden/>
               </w:rPr>
-              <w:fldChar w:fldCharType="begin"/>
+              <w:fldChar w:fldCharType="begin" w:dirty="1"/>
             </w:r>
             <w:r>
               <w:rPr>
@@ -2765,7 +2765,7 @@
                 <w:noProof/>
                 <w:webHidden/>
               </w:rPr>
-              <w:fldChar w:fldCharType="begin"/>
+              <w:fldChar w:fldCharType="begin" w:dirty="1"/>
             </w:r>
             <w:r>
               <w:rPr>
@@ -2839,7 +2839,7 @@
                 <w:noProof/>
                 <w:webHidden/>
               </w:rPr>
-              <w:fldChar w:fldCharType="begin"/>
+              <w:fldChar w:fldCharType="begin" w:dirty="1"/>
             </w:r>
             <w:r>
               <w:rPr>
@@ -2913,7 +2913,7 @@
                 <w:noProof/>
                 <w:webHidden/>
               </w:rPr>
-              <w:fldChar w:fldCharType="begin"/>
+              <w:fldChar w:fldCharType="begin" w:dirty="1"/>
             </w:r>
             <w:r>
               <w:rPr>
@@ -2982,7 +2982,7 @@
               <w:rPr>
                 <w:webHidden/>
               </w:rPr>
-              <w:fldChar w:fldCharType="begin"/>
+              <w:fldChar w:fldCharType="begin" w:dirty="1"/>
             </w:r>
             <w:r>
               <w:rPr>
@@ -3053,7 +3053,7 @@
                 <w:noProof/>
                 <w:webHidden/>
               </w:rPr>
-              <w:fldChar w:fldCharType="begin"/>
+              <w:fldChar w:fldCharType="begin" w:dirty="1"/>
             </w:r>
             <w:r>
               <w:rPr>
@@ -3127,7 +3127,7 @@
                 <w:noProof/>
                 <w:webHidden/>
               </w:rPr>
-              <w:fldChar w:fldCharType="begin"/>
+              <w:fldChar w:fldCharType="begin" w:dirty="1"/>
             </w:r>
             <w:r>
               <w:rPr>
@@ -3201,7 +3201,7 @@
                 <w:noProof/>
                 <w:webHidden/>
               </w:rPr>
-              <w:fldChar w:fldCharType="begin"/>
+              <w:fldChar w:fldCharType="begin" w:dirty="1"/>
             </w:r>
             <w:r>
               <w:rPr>
@@ -3277,7 +3277,7 @@
                 <w:noProof/>
                 <w:webHidden/>
               </w:rPr>
-              <w:fldChar w:fldCharType="begin"/>
+              <w:fldChar w:fldCharType="begin" w:dirty="1"/>
             </w:r>
             <w:r>
               <w:rPr>
@@ -3351,7 +3351,7 @@
                 <w:noProof/>
                 <w:webHidden/>
               </w:rPr>
-              <w:fldChar w:fldCharType="begin"/>
+              <w:fldChar w:fldCharType="begin" w:dirty="1"/>
             </w:r>
             <w:r>
               <w:rPr>
@@ -3425,7 +3425,7 @@
                 <w:noProof/>
                 <w:webHidden/>
               </w:rPr>
-              <w:fldChar w:fldCharType="begin"/>
+              <w:fldChar w:fldCharType="begin" w:dirty="1"/>
             </w:r>
             <w:r>
               <w:rPr>
@@ -3494,7 +3494,7 @@
               <w:rPr>
                 <w:webHidden/>
               </w:rPr>
-              <w:fldChar w:fldCharType="begin"/>
+              <w:fldChar w:fldCharType="begin" w:dirty="1"/>
             </w:r>
             <w:r>
               <w:rPr>
@@ -3558,7 +3558,7 @@
               <w:rPr>
                 <w:webHidden/>
               </w:rPr>
-              <w:fldChar w:fldCharType="begin"/>
+              <w:fldChar w:fldCharType="begin" w:dirty="1"/>
             </w:r>
             <w:r>
               <w:rPr>
@@ -18219,7 +18219,7 @@
           <w:sz w:val="20"/>
           <w:szCs w:val="20"/>
         </w:rPr>
-        <w:fldChar w:fldCharType="begin"/>
+        <w:fldChar w:fldCharType="begin" w:dirty="1"/>
       </w:r>
       <w:r>
         <w:rPr>
@@ -18356,7 +18356,7 @@
           <w:sz w:val="20"/>
           <w:szCs w:val="20"/>
         </w:rPr>
-        <w:fldChar w:fldCharType="begin"/>
+        <w:fldChar w:fldCharType="begin" w:dirty="1"/>
       </w:r>
       <w:r>
         <w:rPr>
@@ -24783,7 +24783,7 @@
           <w:sz w:val="20"/>
           <w:szCs w:val="20"/>
         </w:rPr>
-        <w:fldChar w:fldCharType="begin"/>
+        <w:fldChar w:fldCharType="begin" w:dirty="1"/>
       </w:r>
       <w:r>
         <w:rPr>
@@ -24920,7 +24920,7 @@
           <w:sz w:val="20"/>
           <w:szCs w:val="20"/>
         </w:rPr>
-        <w:fldChar w:fldCharType="begin"/>
+        <w:fldChar w:fldCharType="begin" w:dirty="1"/>
       </w:r>
       <w:r>
         <w:rPr>
@@ -25049,7 +25049,7 @@
           <w:sz w:val="20"/>
           <w:szCs w:val="20"/>
         </w:rPr>
-        <w:fldChar w:fldCharType="begin"/>
+        <w:fldChar w:fldCharType="begin" w:dirty="1"/>
       </w:r>
       <w:r>
         <w:rPr>
@@ -25186,7 +25186,7 @@
           <w:sz w:val="20"/>
           <w:szCs w:val="20"/>
         </w:rPr>
-        <w:fldChar w:fldCharType="begin"/>
+        <w:fldChar w:fldCharType="begin" w:dirty="1"/>
       </w:r>
       <w:r>
         <w:rPr>
@@ -25693,12 +25693,27 @@
       </w:pPr>
       <w:r>
         <w:rPr>
+          <w:sz w:val="21"/>
+        </w:rPr>
+        <w:t>The backend was tested using a combination of integration testing and black-box testing techniques. Integration testing was used to verify that the individual server components — including REST API routes, authentication middleware, Socket.IO real-time communication, and session management — work correctly together as a complete system. Black-box testing was applied by sending HTTP requests and Socket.IO events to the running server and validating the responses, without relying on knowledge of the internal implementation.</w:t>
+      </w:r>
+    </w:p>
+    <w:p>
+      <w:pPr>
+        <w:spacing w:beforeAutospacing="1" w:after="0" w:afterAutospacing="1" w:line="240" w:lineRule="auto"/>
+        <w:textAlignment w:val="baseline"/>
+        <w:rPr>
           <w:rFonts w:ascii="Segoe UI" w:eastAsia="Times New Roman" w:hAnsi="Segoe UI" w:cs="Segoe UI"/>
-          <w:sz w:val="21"/>
-          <w:szCs w:val="21"/>
+          <w:sz w:val="18"/>
+          <w:szCs w:val="18"/>
           <w:lang w:val="en-CA" w:eastAsia="en-CA"/>
         </w:rPr>
-        <w:t>…</w:t>
+      </w:pPr>
+      <w:r>
+        <w:rPr>
+          <w:sz w:val="21"/>
+        </w:rPr>
+        <w:t>Automated tests are written using Node.js's built-in assert module, with the socket.io-client library used to simulate real-time client connections. Tests cover two areas: server integration tests (verifying REST API and Socket.IO behaviour end-to-end) and CORS configuration tests (validating that cross-origin request handling is correctly enforced for both allowed and disallowed origins).</w:t>
       </w:r>
     </w:p>
     <w:p>
@@ -26927,14 +26942,3051 @@
       </w:pPr>
       <w:r>
         <w:rPr>
-          <w:rFonts w:ascii="Segoe UI" w:eastAsia="Times New Roman" w:hAnsi="Segoe UI" w:cs="Segoe UI"/>
-          <w:sz w:val="21"/>
-          <w:szCs w:val="21"/>
-          <w:lang w:val="en-CA" w:eastAsia="en-CA"/>
-        </w:rPr>
-        <w:t>…</w:t>
+          <w:sz w:val="21"/>
+        </w:rPr>
+        <w:t>Backend Integration Test Cases</w:t>
       </w:r>
     </w:p>
+    <w:p/>
+    <w:tbl>
+      <w:tblPr>
+        <w:tblStyle w:val="TableGrid"/>
+        <w:tblW w:type="auto" w:w="0"/>
+        <w:tblLook w:firstColumn="1" w:firstRow="1" w:lastColumn="0" w:lastRow="0" w:noHBand="0" w:noVBand="1" w:val="04A0"/>
+      </w:tblPr>
+      <w:tblGrid>
+        <w:gridCol w:w="4680"/>
+        <w:gridCol w:w="4680"/>
+      </w:tblGrid>
+      <w:tr>
+        <w:tc>
+          <w:tcPr>
+            <w:tcW w:type="dxa" w:w="4680"/>
+          </w:tcPr>
+          <w:p>
+            <w:r>
+              <w:rPr>
+                <w:b/>
+                <w:sz w:val="21"/>
+              </w:rPr>
+              <w:t>Test Case ID</w:t>
+            </w:r>
+          </w:p>
+        </w:tc>
+        <w:tc>
+          <w:tcPr>
+            <w:tcW w:type="dxa" w:w="4680"/>
+          </w:tcPr>
+          <w:p>
+            <w:r>
+              <w:rPr>
+                <w:b w:val="0"/>
+                <w:sz w:val="21"/>
+              </w:rPr>
+              <w:t>BE-IT-01</w:t>
+            </w:r>
+          </w:p>
+        </w:tc>
+      </w:tr>
+      <w:tr>
+        <w:tc>
+          <w:tcPr>
+            <w:tcW w:type="dxa" w:w="4680"/>
+          </w:tcPr>
+          <w:p>
+            <w:r>
+              <w:rPr>
+                <w:b/>
+                <w:sz w:val="21"/>
+              </w:rPr>
+              <w:t>Test Type</w:t>
+            </w:r>
+          </w:p>
+        </w:tc>
+        <w:tc>
+          <w:tcPr>
+            <w:tcW w:type="dxa" w:w="4680"/>
+          </w:tcPr>
+          <w:p>
+            <w:r>
+              <w:rPr>
+                <w:b w:val="0"/>
+                <w:sz w:val="21"/>
+              </w:rPr>
+              <w:t>Integration Testing / Black-Box Testing</w:t>
+            </w:r>
+          </w:p>
+        </w:tc>
+      </w:tr>
+      <w:tr>
+        <w:tc>
+          <w:tcPr>
+            <w:tcW w:type="dxa" w:w="4680"/>
+          </w:tcPr>
+          <w:p>
+            <w:r>
+              <w:rPr>
+                <w:b/>
+                <w:sz w:val="21"/>
+              </w:rPr>
+              <w:t>Component</w:t>
+            </w:r>
+          </w:p>
+        </w:tc>
+        <w:tc>
+          <w:tcPr>
+            <w:tcW w:type="dxa" w:w="4680"/>
+          </w:tcPr>
+          <w:p>
+            <w:r>
+              <w:rPr>
+                <w:b w:val="0"/>
+                <w:sz w:val="21"/>
+              </w:rPr>
+              <w:t>src/routes/sessionRoute.mjs</w:t>
+              <w:br/>
+              <w:t>src/middleware/authMiddleware.mjs</w:t>
+            </w:r>
+          </w:p>
+        </w:tc>
+      </w:tr>
+      <w:tr>
+        <w:tc>
+          <w:tcPr>
+            <w:tcW w:type="dxa" w:w="4680"/>
+          </w:tcPr>
+          <w:p>
+            <w:r>
+              <w:rPr>
+                <w:b/>
+                <w:sz w:val="21"/>
+              </w:rPr>
+              <w:t>Description</w:t>
+            </w:r>
+          </w:p>
+        </w:tc>
+        <w:tc>
+          <w:tcPr>
+            <w:tcW w:type="dxa" w:w="4680"/>
+          </w:tcPr>
+          <w:p>
+            <w:r>
+              <w:rPr>
+                <w:b w:val="0"/>
+                <w:sz w:val="21"/>
+              </w:rPr>
+              <w:t>Verify that the REST API rejects requests without a valid API key and returns HTTP 401 Unauthorized.</w:t>
+            </w:r>
+          </w:p>
+        </w:tc>
+      </w:tr>
+      <w:tr>
+        <w:tc>
+          <w:tcPr>
+            <w:tcW w:type="dxa" w:w="4680"/>
+          </w:tcPr>
+          <w:p>
+            <w:r>
+              <w:rPr>
+                <w:b/>
+                <w:sz w:val="21"/>
+              </w:rPr>
+              <w:t>Preconditions</w:t>
+            </w:r>
+          </w:p>
+        </w:tc>
+        <w:tc>
+          <w:tcPr>
+            <w:tcW w:type="dxa" w:w="4680"/>
+          </w:tcPr>
+          <w:p>
+            <w:r>
+              <w:rPr>
+                <w:b w:val="0"/>
+                <w:sz w:val="21"/>
+              </w:rPr>
+              <w:t>Backend server is running. No API key is provided in the request headers.</w:t>
+            </w:r>
+          </w:p>
+        </w:tc>
+      </w:tr>
+      <w:tr>
+        <w:tc>
+          <w:tcPr>
+            <w:tcW w:type="dxa" w:w="4680"/>
+          </w:tcPr>
+          <w:p>
+            <w:r>
+              <w:rPr>
+                <w:b/>
+                <w:sz w:val="21"/>
+              </w:rPr>
+              <w:t>Expected Result</w:t>
+            </w:r>
+          </w:p>
+        </w:tc>
+        <w:tc>
+          <w:tcPr>
+            <w:tcW w:type="dxa" w:w="4680"/>
+          </w:tcPr>
+          <w:p>
+            <w:r>
+              <w:rPr>
+                <w:b w:val="0"/>
+                <w:sz w:val="21"/>
+              </w:rPr>
+              <w:t>Server returns HTTP 401 Unauthorized for requests without a valid x-api-key header.</w:t>
+            </w:r>
+          </w:p>
+        </w:tc>
+      </w:tr>
+      <w:tr>
+        <w:tc>
+          <w:tcPr>
+            <w:tcW w:type="dxa" w:w="4680"/>
+          </w:tcPr>
+          <w:p>
+            <w:r>
+              <w:rPr>
+                <w:b/>
+                <w:sz w:val="21"/>
+              </w:rPr>
+              <w:t>Actual Result</w:t>
+            </w:r>
+          </w:p>
+        </w:tc>
+        <w:tc>
+          <w:tcPr>
+            <w:tcW w:type="dxa" w:w="4680"/>
+          </w:tcPr>
+          <w:p>
+            <w:r>
+              <w:rPr>
+                <w:b w:val="0"/>
+                <w:sz w:val="21"/>
+              </w:rPr>
+              <w:t>Server correctly returned HTTP 401 for all requests missing or using an invalid API key.</w:t>
+            </w:r>
+          </w:p>
+        </w:tc>
+      </w:tr>
+      <w:tr>
+        <w:tc>
+          <w:tcPr>
+            <w:tcW w:type="dxa" w:w="4680"/>
+          </w:tcPr>
+          <w:p>
+            <w:r>
+              <w:rPr>
+                <w:b/>
+                <w:sz w:val="21"/>
+              </w:rPr>
+              <w:t>Status</w:t>
+            </w:r>
+          </w:p>
+        </w:tc>
+        <w:tc>
+          <w:tcPr>
+            <w:tcW w:type="dxa" w:w="4680"/>
+          </w:tcPr>
+          <w:p>
+            <w:r>
+              <w:rPr>
+                <w:b w:val="0"/>
+                <w:sz w:val="21"/>
+              </w:rPr>
+              <w:t>Pass</w:t>
+            </w:r>
+          </w:p>
+        </w:tc>
+      </w:tr>
+    </w:tbl>
+    <w:p/>
+    <w:tbl>
+      <w:tblPr>
+        <w:tblStyle w:val="TableGrid"/>
+        <w:tblW w:type="auto" w:w="0"/>
+        <w:tblLook w:firstColumn="1" w:firstRow="1" w:lastColumn="0" w:lastRow="0" w:noHBand="0" w:noVBand="1" w:val="04A0"/>
+      </w:tblPr>
+      <w:tblGrid>
+        <w:gridCol w:w="4680"/>
+        <w:gridCol w:w="4680"/>
+      </w:tblGrid>
+      <w:tr>
+        <w:tc>
+          <w:tcPr>
+            <w:tcW w:type="dxa" w:w="4680"/>
+          </w:tcPr>
+          <w:p>
+            <w:r>
+              <w:rPr>
+                <w:b/>
+                <w:sz w:val="21"/>
+              </w:rPr>
+              <w:t>Test Case ID</w:t>
+            </w:r>
+          </w:p>
+        </w:tc>
+        <w:tc>
+          <w:tcPr>
+            <w:tcW w:type="dxa" w:w="4680"/>
+          </w:tcPr>
+          <w:p>
+            <w:r>
+              <w:rPr>
+                <w:b w:val="0"/>
+                <w:sz w:val="21"/>
+              </w:rPr>
+              <w:t>BE-IT-02</w:t>
+            </w:r>
+          </w:p>
+        </w:tc>
+      </w:tr>
+      <w:tr>
+        <w:tc>
+          <w:tcPr>
+            <w:tcW w:type="dxa" w:w="4680"/>
+          </w:tcPr>
+          <w:p>
+            <w:r>
+              <w:rPr>
+                <w:b/>
+                <w:sz w:val="21"/>
+              </w:rPr>
+              <w:t>Test Type</w:t>
+            </w:r>
+          </w:p>
+        </w:tc>
+        <w:tc>
+          <w:tcPr>
+            <w:tcW w:type="dxa" w:w="4680"/>
+          </w:tcPr>
+          <w:p>
+            <w:r>
+              <w:rPr>
+                <w:b w:val="0"/>
+                <w:sz w:val="21"/>
+              </w:rPr>
+              <w:t>Integration Testing / Black-Box Testing</w:t>
+            </w:r>
+          </w:p>
+        </w:tc>
+      </w:tr>
+      <w:tr>
+        <w:tc>
+          <w:tcPr>
+            <w:tcW w:type="dxa" w:w="4680"/>
+          </w:tcPr>
+          <w:p>
+            <w:r>
+              <w:rPr>
+                <w:b/>
+                <w:sz w:val="21"/>
+              </w:rPr>
+              <w:t>Component</w:t>
+            </w:r>
+          </w:p>
+        </w:tc>
+        <w:tc>
+          <w:tcPr>
+            <w:tcW w:type="dxa" w:w="4680"/>
+          </w:tcPr>
+          <w:p>
+            <w:r>
+              <w:rPr>
+                <w:b w:val="0"/>
+                <w:sz w:val="21"/>
+              </w:rPr>
+              <w:t>src/routes/sessionRoute.mjs</w:t>
+              <w:br/>
+              <w:t>src/services/sessionService.mjs</w:t>
+            </w:r>
+          </w:p>
+        </w:tc>
+      </w:tr>
+      <w:tr>
+        <w:tc>
+          <w:tcPr>
+            <w:tcW w:type="dxa" w:w="4680"/>
+          </w:tcPr>
+          <w:p>
+            <w:r>
+              <w:rPr>
+                <w:b/>
+                <w:sz w:val="21"/>
+              </w:rPr>
+              <w:t>Description</w:t>
+            </w:r>
+          </w:p>
+        </w:tc>
+        <w:tc>
+          <w:tcPr>
+            <w:tcW w:type="dxa" w:w="4680"/>
+          </w:tcPr>
+          <w:p>
+            <w:r>
+              <w:rPr>
+                <w:b w:val="0"/>
+                <w:sz w:val="21"/>
+              </w:rPr>
+              <w:t>Verify that an authenticated request to GET /api/session returns a list of active sessions, including a previously created session.</w:t>
+            </w:r>
+          </w:p>
+        </w:tc>
+      </w:tr>
+      <w:tr>
+        <w:tc>
+          <w:tcPr>
+            <w:tcW w:type="dxa" w:w="4680"/>
+          </w:tcPr>
+          <w:p>
+            <w:r>
+              <w:rPr>
+                <w:b/>
+                <w:sz w:val="21"/>
+              </w:rPr>
+              <w:t>Preconditions</w:t>
+            </w:r>
+          </w:p>
+        </w:tc>
+        <w:tc>
+          <w:tcPr>
+            <w:tcW w:type="dxa" w:w="4680"/>
+          </w:tcPr>
+          <w:p>
+            <w:r>
+              <w:rPr>
+                <w:b w:val="0"/>
+                <w:sz w:val="21"/>
+              </w:rPr>
+              <w:t>Backend server is running. A session has been created programmatically before the request. Valid API key is provided.</w:t>
+            </w:r>
+          </w:p>
+        </w:tc>
+      </w:tr>
+      <w:tr>
+        <w:tc>
+          <w:tcPr>
+            <w:tcW w:type="dxa" w:w="4680"/>
+          </w:tcPr>
+          <w:p>
+            <w:r>
+              <w:rPr>
+                <w:b/>
+                <w:sz w:val="21"/>
+              </w:rPr>
+              <w:t>Expected Result</w:t>
+            </w:r>
+          </w:p>
+        </w:tc>
+        <w:tc>
+          <w:tcPr>
+            <w:tcW w:type="dxa" w:w="4680"/>
+          </w:tcPr>
+          <w:p>
+            <w:r>
+              <w:rPr>
+                <w:b w:val="0"/>
+                <w:sz w:val="21"/>
+              </w:rPr>
+              <w:t>Server returns HTTP 200 with a JSON array of sessions. The pre-created session is present in the list.</w:t>
+            </w:r>
+          </w:p>
+        </w:tc>
+      </w:tr>
+      <w:tr>
+        <w:tc>
+          <w:tcPr>
+            <w:tcW w:type="dxa" w:w="4680"/>
+          </w:tcPr>
+          <w:p>
+            <w:r>
+              <w:rPr>
+                <w:b/>
+                <w:sz w:val="21"/>
+              </w:rPr>
+              <w:t>Actual Result</w:t>
+            </w:r>
+          </w:p>
+        </w:tc>
+        <w:tc>
+          <w:tcPr>
+            <w:tcW w:type="dxa" w:w="4680"/>
+          </w:tcPr>
+          <w:p>
+            <w:r>
+              <w:rPr>
+                <w:b w:val="0"/>
+                <w:sz w:val="21"/>
+              </w:rPr>
+              <w:t>Server returned HTTP 200 with a session array containing the expected session entry.</w:t>
+            </w:r>
+          </w:p>
+        </w:tc>
+      </w:tr>
+      <w:tr>
+        <w:tc>
+          <w:tcPr>
+            <w:tcW w:type="dxa" w:w="4680"/>
+          </w:tcPr>
+          <w:p>
+            <w:r>
+              <w:rPr>
+                <w:b/>
+                <w:sz w:val="21"/>
+              </w:rPr>
+              <w:t>Status</w:t>
+            </w:r>
+          </w:p>
+        </w:tc>
+        <w:tc>
+          <w:tcPr>
+            <w:tcW w:type="dxa" w:w="4680"/>
+          </w:tcPr>
+          <w:p>
+            <w:r>
+              <w:rPr>
+                <w:b w:val="0"/>
+                <w:sz w:val="21"/>
+              </w:rPr>
+              <w:t>Pass</w:t>
+            </w:r>
+          </w:p>
+        </w:tc>
+      </w:tr>
+    </w:tbl>
+    <w:p/>
+    <w:tbl>
+      <w:tblPr>
+        <w:tblStyle w:val="TableGrid"/>
+        <w:tblW w:type="auto" w:w="0"/>
+        <w:tblLook w:firstColumn="1" w:firstRow="1" w:lastColumn="0" w:lastRow="0" w:noHBand="0" w:noVBand="1" w:val="04A0"/>
+      </w:tblPr>
+      <w:tblGrid>
+        <w:gridCol w:w="4680"/>
+        <w:gridCol w:w="4680"/>
+      </w:tblGrid>
+      <w:tr>
+        <w:tc>
+          <w:tcPr>
+            <w:tcW w:type="dxa" w:w="4680"/>
+          </w:tcPr>
+          <w:p>
+            <w:r>
+              <w:rPr>
+                <w:b/>
+                <w:sz w:val="21"/>
+              </w:rPr>
+              <w:t>Test Case ID</w:t>
+            </w:r>
+          </w:p>
+        </w:tc>
+        <w:tc>
+          <w:tcPr>
+            <w:tcW w:type="dxa" w:w="4680"/>
+          </w:tcPr>
+          <w:p>
+            <w:r>
+              <w:rPr>
+                <w:b w:val="0"/>
+                <w:sz w:val="21"/>
+              </w:rPr>
+              <w:t>BE-IT-03</w:t>
+            </w:r>
+          </w:p>
+        </w:tc>
+      </w:tr>
+      <w:tr>
+        <w:tc>
+          <w:tcPr>
+            <w:tcW w:type="dxa" w:w="4680"/>
+          </w:tcPr>
+          <w:p>
+            <w:r>
+              <w:rPr>
+                <w:b/>
+                <w:sz w:val="21"/>
+              </w:rPr>
+              <w:t>Test Type</w:t>
+            </w:r>
+          </w:p>
+        </w:tc>
+        <w:tc>
+          <w:tcPr>
+            <w:tcW w:type="dxa" w:w="4680"/>
+          </w:tcPr>
+          <w:p>
+            <w:r>
+              <w:rPr>
+                <w:b w:val="0"/>
+                <w:sz w:val="21"/>
+              </w:rPr>
+              <w:t>Integration Testing / Black-Box Testing</w:t>
+            </w:r>
+          </w:p>
+        </w:tc>
+      </w:tr>
+      <w:tr>
+        <w:tc>
+          <w:tcPr>
+            <w:tcW w:type="dxa" w:w="4680"/>
+          </w:tcPr>
+          <w:p>
+            <w:r>
+              <w:rPr>
+                <w:b/>
+                <w:sz w:val="21"/>
+              </w:rPr>
+              <w:t>Component</w:t>
+            </w:r>
+          </w:p>
+        </w:tc>
+        <w:tc>
+          <w:tcPr>
+            <w:tcW w:type="dxa" w:w="4680"/>
+          </w:tcPr>
+          <w:p>
+            <w:r>
+              <w:rPr>
+                <w:b w:val="0"/>
+                <w:sz w:val="21"/>
+              </w:rPr>
+              <w:t>src/routes/sessionRoute.mjs</w:t>
+              <w:br/>
+              <w:t>src/utils/validation.mjs</w:t>
+            </w:r>
+          </w:p>
+        </w:tc>
+      </w:tr>
+      <w:tr>
+        <w:tc>
+          <w:tcPr>
+            <w:tcW w:type="dxa" w:w="4680"/>
+          </w:tcPr>
+          <w:p>
+            <w:r>
+              <w:rPr>
+                <w:b/>
+                <w:sz w:val="21"/>
+              </w:rPr>
+              <w:t>Description</w:t>
+            </w:r>
+          </w:p>
+        </w:tc>
+        <w:tc>
+          <w:tcPr>
+            <w:tcW w:type="dxa" w:w="4680"/>
+          </w:tcPr>
+          <w:p>
+            <w:r>
+              <w:rPr>
+                <w:b w:val="0"/>
+                <w:sz w:val="21"/>
+              </w:rPr>
+              <w:t>Verify that passing an invalid query parameter (e.g. limit=not-a-number) to GET /api/session returns HTTP 400 Bad Request.</w:t>
+            </w:r>
+          </w:p>
+        </w:tc>
+      </w:tr>
+      <w:tr>
+        <w:tc>
+          <w:tcPr>
+            <w:tcW w:type="dxa" w:w="4680"/>
+          </w:tcPr>
+          <w:p>
+            <w:r>
+              <w:rPr>
+                <w:b/>
+                <w:sz w:val="21"/>
+              </w:rPr>
+              <w:t>Preconditions</w:t>
+            </w:r>
+          </w:p>
+        </w:tc>
+        <w:tc>
+          <w:tcPr>
+            <w:tcW w:type="dxa" w:w="4680"/>
+          </w:tcPr>
+          <w:p>
+            <w:r>
+              <w:rPr>
+                <w:b w:val="0"/>
+                <w:sz w:val="21"/>
+              </w:rPr>
+              <w:t>Backend server is running. Valid API key is provided. Query string contains an invalid limit value.</w:t>
+            </w:r>
+          </w:p>
+        </w:tc>
+      </w:tr>
+      <w:tr>
+        <w:tc>
+          <w:tcPr>
+            <w:tcW w:type="dxa" w:w="4680"/>
+          </w:tcPr>
+          <w:p>
+            <w:r>
+              <w:rPr>
+                <w:b/>
+                <w:sz w:val="21"/>
+              </w:rPr>
+              <w:t>Expected Result</w:t>
+            </w:r>
+          </w:p>
+        </w:tc>
+        <w:tc>
+          <w:tcPr>
+            <w:tcW w:type="dxa" w:w="4680"/>
+          </w:tcPr>
+          <w:p>
+            <w:r>
+              <w:rPr>
+                <w:b w:val="0"/>
+                <w:sz w:val="21"/>
+              </w:rPr>
+              <w:t>Server returns HTTP 400 Bad Request due to invalid query parameter.</w:t>
+            </w:r>
+          </w:p>
+        </w:tc>
+      </w:tr>
+      <w:tr>
+        <w:tc>
+          <w:tcPr>
+            <w:tcW w:type="dxa" w:w="4680"/>
+          </w:tcPr>
+          <w:p>
+            <w:r>
+              <w:rPr>
+                <w:b/>
+                <w:sz w:val="21"/>
+              </w:rPr>
+              <w:t>Actual Result</w:t>
+            </w:r>
+          </w:p>
+        </w:tc>
+        <w:tc>
+          <w:tcPr>
+            <w:tcW w:type="dxa" w:w="4680"/>
+          </w:tcPr>
+          <w:p>
+            <w:r>
+              <w:rPr>
+                <w:b w:val="0"/>
+                <w:sz w:val="21"/>
+              </w:rPr>
+              <w:t>Server correctly returned HTTP 400 when an invalid limit value was provided.</w:t>
+            </w:r>
+          </w:p>
+        </w:tc>
+      </w:tr>
+      <w:tr>
+        <w:tc>
+          <w:tcPr>
+            <w:tcW w:type="dxa" w:w="4680"/>
+          </w:tcPr>
+          <w:p>
+            <w:r>
+              <w:rPr>
+                <w:b/>
+                <w:sz w:val="21"/>
+              </w:rPr>
+              <w:t>Status</w:t>
+            </w:r>
+          </w:p>
+        </w:tc>
+        <w:tc>
+          <w:tcPr>
+            <w:tcW w:type="dxa" w:w="4680"/>
+          </w:tcPr>
+          <w:p>
+            <w:r>
+              <w:rPr>
+                <w:b w:val="0"/>
+                <w:sz w:val="21"/>
+              </w:rPr>
+              <w:t>Pass</w:t>
+            </w:r>
+          </w:p>
+        </w:tc>
+      </w:tr>
+    </w:tbl>
+    <w:p/>
+    <w:tbl>
+      <w:tblPr>
+        <w:tblStyle w:val="TableGrid"/>
+        <w:tblW w:type="auto" w:w="0"/>
+        <w:tblLook w:firstColumn="1" w:firstRow="1" w:lastColumn="0" w:lastRow="0" w:noHBand="0" w:noVBand="1" w:val="04A0"/>
+      </w:tblPr>
+      <w:tblGrid>
+        <w:gridCol w:w="4680"/>
+        <w:gridCol w:w="4680"/>
+      </w:tblGrid>
+      <w:tr>
+        <w:tc>
+          <w:tcPr>
+            <w:tcW w:type="dxa" w:w="4680"/>
+          </w:tcPr>
+          <w:p>
+            <w:r>
+              <w:rPr>
+                <w:b/>
+                <w:sz w:val="21"/>
+              </w:rPr>
+              <w:t>Test Case ID</w:t>
+            </w:r>
+          </w:p>
+        </w:tc>
+        <w:tc>
+          <w:tcPr>
+            <w:tcW w:type="dxa" w:w="4680"/>
+          </w:tcPr>
+          <w:p>
+            <w:r>
+              <w:rPr>
+                <w:b w:val="0"/>
+                <w:sz w:val="21"/>
+              </w:rPr>
+              <w:t>BE-IT-04</w:t>
+            </w:r>
+          </w:p>
+        </w:tc>
+      </w:tr>
+      <w:tr>
+        <w:tc>
+          <w:tcPr>
+            <w:tcW w:type="dxa" w:w="4680"/>
+          </w:tcPr>
+          <w:p>
+            <w:r>
+              <w:rPr>
+                <w:b/>
+                <w:sz w:val="21"/>
+              </w:rPr>
+              <w:t>Test Type</w:t>
+            </w:r>
+          </w:p>
+        </w:tc>
+        <w:tc>
+          <w:tcPr>
+            <w:tcW w:type="dxa" w:w="4680"/>
+          </w:tcPr>
+          <w:p>
+            <w:r>
+              <w:rPr>
+                <w:b w:val="0"/>
+                <w:sz w:val="21"/>
+              </w:rPr>
+              <w:t>Integration Testing / Black-Box Testing</w:t>
+            </w:r>
+          </w:p>
+        </w:tc>
+      </w:tr>
+      <w:tr>
+        <w:tc>
+          <w:tcPr>
+            <w:tcW w:type="dxa" w:w="4680"/>
+          </w:tcPr>
+          <w:p>
+            <w:r>
+              <w:rPr>
+                <w:b/>
+                <w:sz w:val="21"/>
+              </w:rPr>
+              <w:t>Component</w:t>
+            </w:r>
+          </w:p>
+        </w:tc>
+        <w:tc>
+          <w:tcPr>
+            <w:tcW w:type="dxa" w:w="4680"/>
+          </w:tcPr>
+          <w:p>
+            <w:r>
+              <w:rPr>
+                <w:b w:val="0"/>
+                <w:sz w:val="21"/>
+              </w:rPr>
+              <w:t>src/sockets/socketServer.mjs</w:t>
+              <w:br/>
+              <w:t>src/middleware/authMiddleware.mjs</w:t>
+            </w:r>
+          </w:p>
+        </w:tc>
+      </w:tr>
+      <w:tr>
+        <w:tc>
+          <w:tcPr>
+            <w:tcW w:type="dxa" w:w="4680"/>
+          </w:tcPr>
+          <w:p>
+            <w:r>
+              <w:rPr>
+                <w:b/>
+                <w:sz w:val="21"/>
+              </w:rPr>
+              <w:t>Description</w:t>
+            </w:r>
+          </w:p>
+        </w:tc>
+        <w:tc>
+          <w:tcPr>
+            <w:tcW w:type="dxa" w:w="4680"/>
+          </w:tcPr>
+          <w:p>
+            <w:r>
+              <w:rPr>
+                <w:b w:val="0"/>
+                <w:sz w:val="21"/>
+              </w:rPr>
+              <w:t>Verify that a Socket.IO client can authenticate using the legacy extraHeaders method (backward-compatible path) and successfully join a session.</w:t>
+            </w:r>
+          </w:p>
+        </w:tc>
+      </w:tr>
+      <w:tr>
+        <w:tc>
+          <w:tcPr>
+            <w:tcW w:type="dxa" w:w="4680"/>
+          </w:tcPr>
+          <w:p>
+            <w:r>
+              <w:rPr>
+                <w:b/>
+                <w:sz w:val="21"/>
+              </w:rPr>
+              <w:t>Preconditions</w:t>
+            </w:r>
+          </w:p>
+        </w:tc>
+        <w:tc>
+          <w:tcPr>
+            <w:tcW w:type="dxa" w:w="4680"/>
+          </w:tcPr>
+          <w:p>
+            <w:r>
+              <w:rPr>
+                <w:b w:val="0"/>
+                <w:sz w:val="21"/>
+              </w:rPr>
+              <w:t>Backend server is running with Socket.IO. A session exists. API key is passed in extraHeaders.</w:t>
+            </w:r>
+          </w:p>
+        </w:tc>
+      </w:tr>
+      <w:tr>
+        <w:tc>
+          <w:tcPr>
+            <w:tcW w:type="dxa" w:w="4680"/>
+          </w:tcPr>
+          <w:p>
+            <w:r>
+              <w:rPr>
+                <w:b/>
+                <w:sz w:val="21"/>
+              </w:rPr>
+              <w:t>Expected Result</w:t>
+            </w:r>
+          </w:p>
+        </w:tc>
+        <w:tc>
+          <w:tcPr>
+            <w:tcW w:type="dxa" w:w="4680"/>
+          </w:tcPr>
+          <w:p>
+            <w:r>
+              <w:rPr>
+                <w:b w:val="0"/>
+                <w:sz w:val="21"/>
+              </w:rPr>
+              <w:t>Client connects successfully and receives a session:joined event with the correct session code.</w:t>
+            </w:r>
+          </w:p>
+        </w:tc>
+      </w:tr>
+      <w:tr>
+        <w:tc>
+          <w:tcPr>
+            <w:tcW w:type="dxa" w:w="4680"/>
+          </w:tcPr>
+          <w:p>
+            <w:r>
+              <w:rPr>
+                <w:b/>
+                <w:sz w:val="21"/>
+              </w:rPr>
+              <w:t>Actual Result</w:t>
+            </w:r>
+          </w:p>
+        </w:tc>
+        <w:tc>
+          <w:tcPr>
+            <w:tcW w:type="dxa" w:w="4680"/>
+          </w:tcPr>
+          <w:p>
+            <w:r>
+              <w:rPr>
+                <w:b w:val="0"/>
+                <w:sz w:val="21"/>
+              </w:rPr>
+              <w:t>Client connected and received session:joined with the expected session code and timeline index of -1.</w:t>
+            </w:r>
+          </w:p>
+        </w:tc>
+      </w:tr>
+      <w:tr>
+        <w:tc>
+          <w:tcPr>
+            <w:tcW w:type="dxa" w:w="4680"/>
+          </w:tcPr>
+          <w:p>
+            <w:r>
+              <w:rPr>
+                <w:b/>
+                <w:sz w:val="21"/>
+              </w:rPr>
+              <w:t>Status</w:t>
+            </w:r>
+          </w:p>
+        </w:tc>
+        <w:tc>
+          <w:tcPr>
+            <w:tcW w:type="dxa" w:w="4680"/>
+          </w:tcPr>
+          <w:p>
+            <w:r>
+              <w:rPr>
+                <w:b w:val="0"/>
+                <w:sz w:val="21"/>
+              </w:rPr>
+              <w:t>Pass</w:t>
+            </w:r>
+          </w:p>
+        </w:tc>
+      </w:tr>
+    </w:tbl>
+    <w:p/>
+    <w:tbl>
+      <w:tblPr>
+        <w:tblStyle w:val="TableGrid"/>
+        <w:tblW w:type="auto" w:w="0"/>
+        <w:tblLook w:firstColumn="1" w:firstRow="1" w:lastColumn="0" w:lastRow="0" w:noHBand="0" w:noVBand="1" w:val="04A0"/>
+      </w:tblPr>
+      <w:tblGrid>
+        <w:gridCol w:w="4680"/>
+        <w:gridCol w:w="4680"/>
+      </w:tblGrid>
+      <w:tr>
+        <w:tc>
+          <w:tcPr>
+            <w:tcW w:type="dxa" w:w="4680"/>
+          </w:tcPr>
+          <w:p>
+            <w:r>
+              <w:rPr>
+                <w:b/>
+                <w:sz w:val="21"/>
+              </w:rPr>
+              <w:t>Test Case ID</w:t>
+            </w:r>
+          </w:p>
+        </w:tc>
+        <w:tc>
+          <w:tcPr>
+            <w:tcW w:type="dxa" w:w="4680"/>
+          </w:tcPr>
+          <w:p>
+            <w:r>
+              <w:rPr>
+                <w:b w:val="0"/>
+                <w:sz w:val="21"/>
+              </w:rPr>
+              <w:t>BE-IT-05</w:t>
+            </w:r>
+          </w:p>
+        </w:tc>
+      </w:tr>
+      <w:tr>
+        <w:tc>
+          <w:tcPr>
+            <w:tcW w:type="dxa" w:w="4680"/>
+          </w:tcPr>
+          <w:p>
+            <w:r>
+              <w:rPr>
+                <w:b/>
+                <w:sz w:val="21"/>
+              </w:rPr>
+              <w:t>Test Type</w:t>
+            </w:r>
+          </w:p>
+        </w:tc>
+        <w:tc>
+          <w:tcPr>
+            <w:tcW w:type="dxa" w:w="4680"/>
+          </w:tcPr>
+          <w:p>
+            <w:r>
+              <w:rPr>
+                <w:b w:val="0"/>
+                <w:sz w:val="21"/>
+              </w:rPr>
+              <w:t>Integration Testing / Black-Box Testing</w:t>
+            </w:r>
+          </w:p>
+        </w:tc>
+      </w:tr>
+      <w:tr>
+        <w:tc>
+          <w:tcPr>
+            <w:tcW w:type="dxa" w:w="4680"/>
+          </w:tcPr>
+          <w:p>
+            <w:r>
+              <w:rPr>
+                <w:b/>
+                <w:sz w:val="21"/>
+              </w:rPr>
+              <w:t>Component</w:t>
+            </w:r>
+          </w:p>
+        </w:tc>
+        <w:tc>
+          <w:tcPr>
+            <w:tcW w:type="dxa" w:w="4680"/>
+          </w:tcPr>
+          <w:p>
+            <w:r>
+              <w:rPr>
+                <w:b w:val="0"/>
+                <w:sz w:val="21"/>
+              </w:rPr>
+              <w:t>src/sockets/socketServer.mjs</w:t>
+              <w:br/>
+              <w:t>src/middleware/authMiddleware.mjs</w:t>
+            </w:r>
+          </w:p>
+        </w:tc>
+      </w:tr>
+      <w:tr>
+        <w:tc>
+          <w:tcPr>
+            <w:tcW w:type="dxa" w:w="4680"/>
+          </w:tcPr>
+          <w:p>
+            <w:r>
+              <w:rPr>
+                <w:b/>
+                <w:sz w:val="21"/>
+              </w:rPr>
+              <w:t>Description</w:t>
+            </w:r>
+          </w:p>
+        </w:tc>
+        <w:tc>
+          <w:tcPr>
+            <w:tcW w:type="dxa" w:w="4680"/>
+          </w:tcPr>
+          <w:p>
+            <w:r>
+              <w:rPr>
+                <w:b w:val="0"/>
+                <w:sz w:val="21"/>
+              </w:rPr>
+              <w:t>Verify that a Socket.IO client can authenticate using the auth payload method (browser-safe primary path) and successfully join a session.</w:t>
+            </w:r>
+          </w:p>
+        </w:tc>
+      </w:tr>
+      <w:tr>
+        <w:tc>
+          <w:tcPr>
+            <w:tcW w:type="dxa" w:w="4680"/>
+          </w:tcPr>
+          <w:p>
+            <w:r>
+              <w:rPr>
+                <w:b/>
+                <w:sz w:val="21"/>
+              </w:rPr>
+              <w:t>Preconditions</w:t>
+            </w:r>
+          </w:p>
+        </w:tc>
+        <w:tc>
+          <w:tcPr>
+            <w:tcW w:type="dxa" w:w="4680"/>
+          </w:tcPr>
+          <w:p>
+            <w:r>
+              <w:rPr>
+                <w:b w:val="0"/>
+                <w:sz w:val="21"/>
+              </w:rPr>
+              <w:t>Backend server is running with Socket.IO. A session exists. API key is passed in the auth object.</w:t>
+            </w:r>
+          </w:p>
+        </w:tc>
+      </w:tr>
+      <w:tr>
+        <w:tc>
+          <w:tcPr>
+            <w:tcW w:type="dxa" w:w="4680"/>
+          </w:tcPr>
+          <w:p>
+            <w:r>
+              <w:rPr>
+                <w:b/>
+                <w:sz w:val="21"/>
+              </w:rPr>
+              <w:t>Expected Result</w:t>
+            </w:r>
+          </w:p>
+        </w:tc>
+        <w:tc>
+          <w:tcPr>
+            <w:tcW w:type="dxa" w:w="4680"/>
+          </w:tcPr>
+          <w:p>
+            <w:r>
+              <w:rPr>
+                <w:b w:val="0"/>
+                <w:sz w:val="21"/>
+              </w:rPr>
+              <w:t>Client connects successfully and receives a session:joined event with the correct session code.</w:t>
+            </w:r>
+          </w:p>
+        </w:tc>
+      </w:tr>
+      <w:tr>
+        <w:tc>
+          <w:tcPr>
+            <w:tcW w:type="dxa" w:w="4680"/>
+          </w:tcPr>
+          <w:p>
+            <w:r>
+              <w:rPr>
+                <w:b/>
+                <w:sz w:val="21"/>
+              </w:rPr>
+              <w:t>Actual Result</w:t>
+            </w:r>
+          </w:p>
+        </w:tc>
+        <w:tc>
+          <w:tcPr>
+            <w:tcW w:type="dxa" w:w="4680"/>
+          </w:tcPr>
+          <w:p>
+            <w:r>
+              <w:rPr>
+                <w:b w:val="0"/>
+                <w:sz w:val="21"/>
+              </w:rPr>
+              <w:t>Client connected and received session:joined with the expected session code.</w:t>
+            </w:r>
+          </w:p>
+        </w:tc>
+      </w:tr>
+      <w:tr>
+        <w:tc>
+          <w:tcPr>
+            <w:tcW w:type="dxa" w:w="4680"/>
+          </w:tcPr>
+          <w:p>
+            <w:r>
+              <w:rPr>
+                <w:b/>
+                <w:sz w:val="21"/>
+              </w:rPr>
+              <w:t>Status</w:t>
+            </w:r>
+          </w:p>
+        </w:tc>
+        <w:tc>
+          <w:tcPr>
+            <w:tcW w:type="dxa" w:w="4680"/>
+          </w:tcPr>
+          <w:p>
+            <w:r>
+              <w:rPr>
+                <w:b w:val="0"/>
+                <w:sz w:val="21"/>
+              </w:rPr>
+              <w:t>Pass</w:t>
+            </w:r>
+          </w:p>
+        </w:tc>
+      </w:tr>
+    </w:tbl>
+    <w:p/>
+    <w:tbl>
+      <w:tblPr>
+        <w:tblStyle w:val="TableGrid"/>
+        <w:tblW w:type="auto" w:w="0"/>
+        <w:tblLook w:firstColumn="1" w:firstRow="1" w:lastColumn="0" w:lastRow="0" w:noHBand="0" w:noVBand="1" w:val="04A0"/>
+      </w:tblPr>
+      <w:tblGrid>
+        <w:gridCol w:w="4680"/>
+        <w:gridCol w:w="4680"/>
+      </w:tblGrid>
+      <w:tr>
+        <w:tc>
+          <w:tcPr>
+            <w:tcW w:type="dxa" w:w="4680"/>
+          </w:tcPr>
+          <w:p>
+            <w:r>
+              <w:rPr>
+                <w:b/>
+                <w:sz w:val="21"/>
+              </w:rPr>
+              <w:t>Test Case ID</w:t>
+            </w:r>
+          </w:p>
+        </w:tc>
+        <w:tc>
+          <w:tcPr>
+            <w:tcW w:type="dxa" w:w="4680"/>
+          </w:tcPr>
+          <w:p>
+            <w:r>
+              <w:rPr>
+                <w:b w:val="0"/>
+                <w:sz w:val="21"/>
+              </w:rPr>
+              <w:t>BE-IT-06</w:t>
+            </w:r>
+          </w:p>
+        </w:tc>
+      </w:tr>
+      <w:tr>
+        <w:tc>
+          <w:tcPr>
+            <w:tcW w:type="dxa" w:w="4680"/>
+          </w:tcPr>
+          <w:p>
+            <w:r>
+              <w:rPr>
+                <w:b/>
+                <w:sz w:val="21"/>
+              </w:rPr>
+              <w:t>Test Type</w:t>
+            </w:r>
+          </w:p>
+        </w:tc>
+        <w:tc>
+          <w:tcPr>
+            <w:tcW w:type="dxa" w:w="4680"/>
+          </w:tcPr>
+          <w:p>
+            <w:r>
+              <w:rPr>
+                <w:b w:val="0"/>
+                <w:sz w:val="21"/>
+              </w:rPr>
+              <w:t>Integration Testing / Black-Box Testing</w:t>
+            </w:r>
+          </w:p>
+        </w:tc>
+      </w:tr>
+      <w:tr>
+        <w:tc>
+          <w:tcPr>
+            <w:tcW w:type="dxa" w:w="4680"/>
+          </w:tcPr>
+          <w:p>
+            <w:r>
+              <w:rPr>
+                <w:b/>
+                <w:sz w:val="21"/>
+              </w:rPr>
+              <w:t>Component</w:t>
+            </w:r>
+          </w:p>
+        </w:tc>
+        <w:tc>
+          <w:tcPr>
+            <w:tcW w:type="dxa" w:w="4680"/>
+          </w:tcPr>
+          <w:p>
+            <w:r>
+              <w:rPr>
+                <w:b w:val="0"/>
+                <w:sz w:val="21"/>
+              </w:rPr>
+              <w:t>src/sockets/socketServer.mjs</w:t>
+              <w:br/>
+              <w:t>src/middleware/authMiddleware.mjs</w:t>
+            </w:r>
+          </w:p>
+        </w:tc>
+      </w:tr>
+      <w:tr>
+        <w:tc>
+          <w:tcPr>
+            <w:tcW w:type="dxa" w:w="4680"/>
+          </w:tcPr>
+          <w:p>
+            <w:r>
+              <w:rPr>
+                <w:b/>
+                <w:sz w:val="21"/>
+              </w:rPr>
+              <w:t>Description</w:t>
+            </w:r>
+          </w:p>
+        </w:tc>
+        <w:tc>
+          <w:tcPr>
+            <w:tcW w:type="dxa" w:w="4680"/>
+          </w:tcPr>
+          <w:p>
+            <w:r>
+              <w:rPr>
+                <w:b w:val="0"/>
+                <w:sz w:val="21"/>
+              </w:rPr>
+              <w:t>Verify that a Socket.IO connection attempt using a wrong API key is rejected with an UNAUTHORIZED error.</w:t>
+            </w:r>
+          </w:p>
+        </w:tc>
+      </w:tr>
+      <w:tr>
+        <w:tc>
+          <w:tcPr>
+            <w:tcW w:type="dxa" w:w="4680"/>
+          </w:tcPr>
+          <w:p>
+            <w:r>
+              <w:rPr>
+                <w:b/>
+                <w:sz w:val="21"/>
+              </w:rPr>
+              <w:t>Preconditions</w:t>
+            </w:r>
+          </w:p>
+        </w:tc>
+        <w:tc>
+          <w:tcPr>
+            <w:tcW w:type="dxa" w:w="4680"/>
+          </w:tcPr>
+          <w:p>
+            <w:r>
+              <w:rPr>
+                <w:b w:val="0"/>
+                <w:sz w:val="21"/>
+              </w:rPr>
+              <w:t>Backend server is running with Socket.IO. An incorrect API key is used in the auth payload.</w:t>
+            </w:r>
+          </w:p>
+        </w:tc>
+      </w:tr>
+      <w:tr>
+        <w:tc>
+          <w:tcPr>
+            <w:tcW w:type="dxa" w:w="4680"/>
+          </w:tcPr>
+          <w:p>
+            <w:r>
+              <w:rPr>
+                <w:b/>
+                <w:sz w:val="21"/>
+              </w:rPr>
+              <w:t>Expected Result</w:t>
+            </w:r>
+          </w:p>
+        </w:tc>
+        <w:tc>
+          <w:tcPr>
+            <w:tcW w:type="dxa" w:w="4680"/>
+          </w:tcPr>
+          <w:p>
+            <w:r>
+              <w:rPr>
+                <w:b w:val="0"/>
+                <w:sz w:val="21"/>
+              </w:rPr>
+              <w:t>Connection is refused and the client receives a connect_error event containing the message UNAUTHORIZED.</w:t>
+            </w:r>
+          </w:p>
+        </w:tc>
+      </w:tr>
+      <w:tr>
+        <w:tc>
+          <w:tcPr>
+            <w:tcW w:type="dxa" w:w="4680"/>
+          </w:tcPr>
+          <w:p>
+            <w:r>
+              <w:rPr>
+                <w:b/>
+                <w:sz w:val="21"/>
+              </w:rPr>
+              <w:t>Actual Result</w:t>
+            </w:r>
+          </w:p>
+        </w:tc>
+        <w:tc>
+          <w:tcPr>
+            <w:tcW w:type="dxa" w:w="4680"/>
+          </w:tcPr>
+          <w:p>
+            <w:r>
+              <w:rPr>
+                <w:b w:val="0"/>
+                <w:sz w:val="21"/>
+              </w:rPr>
+              <w:t>Connection was refused and the connect_error event contained the UNAUTHORIZED message as expected.</w:t>
+            </w:r>
+          </w:p>
+        </w:tc>
+      </w:tr>
+      <w:tr>
+        <w:tc>
+          <w:tcPr>
+            <w:tcW w:type="dxa" w:w="4680"/>
+          </w:tcPr>
+          <w:p>
+            <w:r>
+              <w:rPr>
+                <w:b/>
+                <w:sz w:val="21"/>
+              </w:rPr>
+              <w:t>Status</w:t>
+            </w:r>
+          </w:p>
+        </w:tc>
+        <w:tc>
+          <w:tcPr>
+            <w:tcW w:type="dxa" w:w="4680"/>
+          </w:tcPr>
+          <w:p>
+            <w:r>
+              <w:rPr>
+                <w:b w:val="0"/>
+                <w:sz w:val="21"/>
+              </w:rPr>
+              <w:t>Pass</w:t>
+            </w:r>
+          </w:p>
+        </w:tc>
+      </w:tr>
+    </w:tbl>
+    <w:p/>
+    <w:tbl>
+      <w:tblPr>
+        <w:tblStyle w:val="TableGrid"/>
+        <w:tblW w:type="auto" w:w="0"/>
+        <w:tblLook w:firstColumn="1" w:firstRow="1" w:lastColumn="0" w:lastRow="0" w:noHBand="0" w:noVBand="1" w:val="04A0"/>
+      </w:tblPr>
+      <w:tblGrid>
+        <w:gridCol w:w="4680"/>
+        <w:gridCol w:w="4680"/>
+      </w:tblGrid>
+      <w:tr>
+        <w:tc>
+          <w:tcPr>
+            <w:tcW w:type="dxa" w:w="4680"/>
+          </w:tcPr>
+          <w:p>
+            <w:r>
+              <w:rPr>
+                <w:b/>
+                <w:sz w:val="21"/>
+              </w:rPr>
+              <w:t>Test Case ID</w:t>
+            </w:r>
+          </w:p>
+        </w:tc>
+        <w:tc>
+          <w:tcPr>
+            <w:tcW w:type="dxa" w:w="4680"/>
+          </w:tcPr>
+          <w:p>
+            <w:r>
+              <w:rPr>
+                <w:b w:val="0"/>
+                <w:sz w:val="21"/>
+              </w:rPr>
+              <w:t>BE-IT-07</w:t>
+            </w:r>
+          </w:p>
+        </w:tc>
+      </w:tr>
+      <w:tr>
+        <w:tc>
+          <w:tcPr>
+            <w:tcW w:type="dxa" w:w="4680"/>
+          </w:tcPr>
+          <w:p>
+            <w:r>
+              <w:rPr>
+                <w:b/>
+                <w:sz w:val="21"/>
+              </w:rPr>
+              <w:t>Test Type</w:t>
+            </w:r>
+          </w:p>
+        </w:tc>
+        <w:tc>
+          <w:tcPr>
+            <w:tcW w:type="dxa" w:w="4680"/>
+          </w:tcPr>
+          <w:p>
+            <w:r>
+              <w:rPr>
+                <w:b w:val="0"/>
+                <w:sz w:val="21"/>
+              </w:rPr>
+              <w:t>Integration Testing / Black-Box Testing</w:t>
+            </w:r>
+          </w:p>
+        </w:tc>
+      </w:tr>
+      <w:tr>
+        <w:tc>
+          <w:tcPr>
+            <w:tcW w:type="dxa" w:w="4680"/>
+          </w:tcPr>
+          <w:p>
+            <w:r>
+              <w:rPr>
+                <w:b/>
+                <w:sz w:val="21"/>
+              </w:rPr>
+              <w:t>Component</w:t>
+            </w:r>
+          </w:p>
+        </w:tc>
+        <w:tc>
+          <w:tcPr>
+            <w:tcW w:type="dxa" w:w="4680"/>
+          </w:tcPr>
+          <w:p>
+            <w:r>
+              <w:rPr>
+                <w:b w:val="0"/>
+                <w:sz w:val="21"/>
+              </w:rPr>
+              <w:t>src/routes/sessionRoute.mjs</w:t>
+              <w:br/>
+              <w:t>src/middleware/authMiddleware.mjs</w:t>
+            </w:r>
+          </w:p>
+        </w:tc>
+      </w:tr>
+      <w:tr>
+        <w:tc>
+          <w:tcPr>
+            <w:tcW w:type="dxa" w:w="4680"/>
+          </w:tcPr>
+          <w:p>
+            <w:r>
+              <w:rPr>
+                <w:b/>
+                <w:sz w:val="21"/>
+              </w:rPr>
+              <w:t>Description</w:t>
+            </w:r>
+          </w:p>
+        </w:tc>
+        <w:tc>
+          <w:tcPr>
+            <w:tcW w:type="dxa" w:w="4680"/>
+          </w:tcPr>
+          <w:p>
+            <w:r>
+              <w:rPr>
+                <w:b w:val="0"/>
+                <w:sz w:val="21"/>
+              </w:rPr>
+              <w:t>Verify that DELETE /api/session/:code requires both an API key and a ticket ID header, and that omitting the ticket ID returns HTTP 400.</w:t>
+            </w:r>
+          </w:p>
+        </w:tc>
+      </w:tr>
+      <w:tr>
+        <w:tc>
+          <w:tcPr>
+            <w:tcW w:type="dxa" w:w="4680"/>
+          </w:tcPr>
+          <w:p>
+            <w:r>
+              <w:rPr>
+                <w:b/>
+                <w:sz w:val="21"/>
+              </w:rPr>
+              <w:t>Preconditions</w:t>
+            </w:r>
+          </w:p>
+        </w:tc>
+        <w:tc>
+          <w:tcPr>
+            <w:tcW w:type="dxa" w:w="4680"/>
+          </w:tcPr>
+          <w:p>
+            <w:r>
+              <w:rPr>
+                <w:b w:val="0"/>
+                <w:sz w:val="21"/>
+              </w:rPr>
+              <w:t>Backend server is running. A session exists. API key is provided but ticket ID header is omitted.</w:t>
+            </w:r>
+          </w:p>
+        </w:tc>
+      </w:tr>
+      <w:tr>
+        <w:tc>
+          <w:tcPr>
+            <w:tcW w:type="dxa" w:w="4680"/>
+          </w:tcPr>
+          <w:p>
+            <w:r>
+              <w:rPr>
+                <w:b/>
+                <w:sz w:val="21"/>
+              </w:rPr>
+              <w:t>Expected Result</w:t>
+            </w:r>
+          </w:p>
+        </w:tc>
+        <w:tc>
+          <w:tcPr>
+            <w:tcW w:type="dxa" w:w="4680"/>
+          </w:tcPr>
+          <w:p>
+            <w:r>
+              <w:rPr>
+                <w:b w:val="0"/>
+                <w:sz w:val="21"/>
+              </w:rPr>
+              <w:t>Server returns HTTP 400 when the ticket ID header is missing.</w:t>
+            </w:r>
+          </w:p>
+        </w:tc>
+      </w:tr>
+      <w:tr>
+        <w:tc>
+          <w:tcPr>
+            <w:tcW w:type="dxa" w:w="4680"/>
+          </w:tcPr>
+          <w:p>
+            <w:r>
+              <w:rPr>
+                <w:b/>
+                <w:sz w:val="21"/>
+              </w:rPr>
+              <w:t>Actual Result</w:t>
+            </w:r>
+          </w:p>
+        </w:tc>
+        <w:tc>
+          <w:tcPr>
+            <w:tcW w:type="dxa" w:w="4680"/>
+          </w:tcPr>
+          <w:p>
+            <w:r>
+              <w:rPr>
+                <w:b w:val="0"/>
+                <w:sz w:val="21"/>
+              </w:rPr>
+              <w:t>Server correctly returned HTTP 400 when the x-ticket-id header was absent.</w:t>
+            </w:r>
+          </w:p>
+        </w:tc>
+      </w:tr>
+      <w:tr>
+        <w:tc>
+          <w:tcPr>
+            <w:tcW w:type="dxa" w:w="4680"/>
+          </w:tcPr>
+          <w:p>
+            <w:r>
+              <w:rPr>
+                <w:b/>
+                <w:sz w:val="21"/>
+              </w:rPr>
+              <w:t>Status</w:t>
+            </w:r>
+          </w:p>
+        </w:tc>
+        <w:tc>
+          <w:tcPr>
+            <w:tcW w:type="dxa" w:w="4680"/>
+          </w:tcPr>
+          <w:p>
+            <w:r>
+              <w:rPr>
+                <w:b w:val="0"/>
+                <w:sz w:val="21"/>
+              </w:rPr>
+              <w:t>Pass</w:t>
+            </w:r>
+          </w:p>
+        </w:tc>
+      </w:tr>
+    </w:tbl>
+    <w:p/>
+    <w:tbl>
+      <w:tblPr>
+        <w:tblStyle w:val="TableGrid"/>
+        <w:tblW w:type="auto" w:w="0"/>
+        <w:tblLook w:firstColumn="1" w:firstRow="1" w:lastColumn="0" w:lastRow="0" w:noHBand="0" w:noVBand="1" w:val="04A0"/>
+      </w:tblPr>
+      <w:tblGrid>
+        <w:gridCol w:w="4680"/>
+        <w:gridCol w:w="4680"/>
+      </w:tblGrid>
+      <w:tr>
+        <w:tc>
+          <w:tcPr>
+            <w:tcW w:type="dxa" w:w="4680"/>
+          </w:tcPr>
+          <w:p>
+            <w:r>
+              <w:rPr>
+                <w:b/>
+                <w:sz w:val="21"/>
+              </w:rPr>
+              <w:t>Test Case ID</w:t>
+            </w:r>
+          </w:p>
+        </w:tc>
+        <w:tc>
+          <w:tcPr>
+            <w:tcW w:type="dxa" w:w="4680"/>
+          </w:tcPr>
+          <w:p>
+            <w:r>
+              <w:rPr>
+                <w:b w:val="0"/>
+                <w:sz w:val="21"/>
+              </w:rPr>
+              <w:t>BE-IT-08</w:t>
+            </w:r>
+          </w:p>
+        </w:tc>
+      </w:tr>
+      <w:tr>
+        <w:tc>
+          <w:tcPr>
+            <w:tcW w:type="dxa" w:w="4680"/>
+          </w:tcPr>
+          <w:p>
+            <w:r>
+              <w:rPr>
+                <w:b/>
+                <w:sz w:val="21"/>
+              </w:rPr>
+              <w:t>Test Type</w:t>
+            </w:r>
+          </w:p>
+        </w:tc>
+        <w:tc>
+          <w:tcPr>
+            <w:tcW w:type="dxa" w:w="4680"/>
+          </w:tcPr>
+          <w:p>
+            <w:r>
+              <w:rPr>
+                <w:b w:val="0"/>
+                <w:sz w:val="21"/>
+              </w:rPr>
+              <w:t>Integration Testing / Black-Box Testing</w:t>
+            </w:r>
+          </w:p>
+        </w:tc>
+      </w:tr>
+      <w:tr>
+        <w:tc>
+          <w:tcPr>
+            <w:tcW w:type="dxa" w:w="4680"/>
+          </w:tcPr>
+          <w:p>
+            <w:r>
+              <w:rPr>
+                <w:b/>
+                <w:sz w:val="21"/>
+              </w:rPr>
+              <w:t>Component</w:t>
+            </w:r>
+          </w:p>
+        </w:tc>
+        <w:tc>
+          <w:tcPr>
+            <w:tcW w:type="dxa" w:w="4680"/>
+          </w:tcPr>
+          <w:p>
+            <w:r>
+              <w:rPr>
+                <w:b w:val="0"/>
+                <w:sz w:val="21"/>
+              </w:rPr>
+              <w:t>src/routes/sessionRoute.mjs</w:t>
+              <w:br/>
+              <w:t>src/services/sessionService.mjs</w:t>
+            </w:r>
+          </w:p>
+        </w:tc>
+      </w:tr>
+      <w:tr>
+        <w:tc>
+          <w:tcPr>
+            <w:tcW w:type="dxa" w:w="4680"/>
+          </w:tcPr>
+          <w:p>
+            <w:r>
+              <w:rPr>
+                <w:b/>
+                <w:sz w:val="21"/>
+              </w:rPr>
+              <w:t>Description</w:t>
+            </w:r>
+          </w:p>
+        </w:tc>
+        <w:tc>
+          <w:tcPr>
+            <w:tcW w:type="dxa" w:w="4680"/>
+          </w:tcPr>
+          <w:p>
+            <w:r>
+              <w:rPr>
+                <w:b w:val="0"/>
+                <w:sz w:val="21"/>
+              </w:rPr>
+              <w:t>Verify that DELETE /api/session/:code with both a valid API key and ticket ID successfully deletes the session and removes it from subsequent session list responses.</w:t>
+            </w:r>
+          </w:p>
+        </w:tc>
+      </w:tr>
+      <w:tr>
+        <w:tc>
+          <w:tcPr>
+            <w:tcW w:type="dxa" w:w="4680"/>
+          </w:tcPr>
+          <w:p>
+            <w:r>
+              <w:rPr>
+                <w:b/>
+                <w:sz w:val="21"/>
+              </w:rPr>
+              <w:t>Preconditions</w:t>
+            </w:r>
+          </w:p>
+        </w:tc>
+        <w:tc>
+          <w:tcPr>
+            <w:tcW w:type="dxa" w:w="4680"/>
+          </w:tcPr>
+          <w:p>
+            <w:r>
+              <w:rPr>
+                <w:b w:val="0"/>
+                <w:sz w:val="21"/>
+              </w:rPr>
+              <w:t>Backend server is running. A session exists. Both API key and ticket ID headers are provided.</w:t>
+            </w:r>
+          </w:p>
+        </w:tc>
+      </w:tr>
+      <w:tr>
+        <w:tc>
+          <w:tcPr>
+            <w:tcW w:type="dxa" w:w="4680"/>
+          </w:tcPr>
+          <w:p>
+            <w:r>
+              <w:rPr>
+                <w:b/>
+                <w:sz w:val="21"/>
+              </w:rPr>
+              <w:t>Expected Result</w:t>
+            </w:r>
+          </w:p>
+        </w:tc>
+        <w:tc>
+          <w:tcPr>
+            <w:tcW w:type="dxa" w:w="4680"/>
+          </w:tcPr>
+          <w:p>
+            <w:r>
+              <w:rPr>
+                <w:b w:val="0"/>
+                <w:sz w:val="21"/>
+              </w:rPr>
+              <w:t>Server returns HTTP 200 and the session no longer appears in a subsequent GET /api/session response.</w:t>
+            </w:r>
+          </w:p>
+        </w:tc>
+      </w:tr>
+      <w:tr>
+        <w:tc>
+          <w:tcPr>
+            <w:tcW w:type="dxa" w:w="4680"/>
+          </w:tcPr>
+          <w:p>
+            <w:r>
+              <w:rPr>
+                <w:b/>
+                <w:sz w:val="21"/>
+              </w:rPr>
+              <w:t>Actual Result</w:t>
+            </w:r>
+          </w:p>
+        </w:tc>
+        <w:tc>
+          <w:tcPr>
+            <w:tcW w:type="dxa" w:w="4680"/>
+          </w:tcPr>
+          <w:p>
+            <w:r>
+              <w:rPr>
+                <w:b w:val="0"/>
+                <w:sz w:val="21"/>
+              </w:rPr>
+              <w:t>Server returned HTTP 200 and the session was absent from the subsequent session list.</w:t>
+            </w:r>
+          </w:p>
+        </w:tc>
+      </w:tr>
+      <w:tr>
+        <w:tc>
+          <w:tcPr>
+            <w:tcW w:type="dxa" w:w="4680"/>
+          </w:tcPr>
+          <w:p>
+            <w:r>
+              <w:rPr>
+                <w:b/>
+                <w:sz w:val="21"/>
+              </w:rPr>
+              <w:t>Status</w:t>
+            </w:r>
+          </w:p>
+        </w:tc>
+        <w:tc>
+          <w:tcPr>
+            <w:tcW w:type="dxa" w:w="4680"/>
+          </w:tcPr>
+          <w:p>
+            <w:r>
+              <w:rPr>
+                <w:b w:val="0"/>
+                <w:sz w:val="21"/>
+              </w:rPr>
+              <w:t>Pass</w:t>
+            </w:r>
+          </w:p>
+        </w:tc>
+      </w:tr>
+    </w:tbl>
+    <w:p/>
+    <w:tbl>
+      <w:tblPr>
+        <w:tblStyle w:val="TableGrid"/>
+        <w:tblW w:type="auto" w:w="0"/>
+        <w:tblLook w:firstColumn="1" w:firstRow="1" w:lastColumn="0" w:lastRow="0" w:noHBand="0" w:noVBand="1" w:val="04A0"/>
+      </w:tblPr>
+      <w:tblGrid>
+        <w:gridCol w:w="4680"/>
+        <w:gridCol w:w="4680"/>
+      </w:tblGrid>
+      <w:tr>
+        <w:tc>
+          <w:tcPr>
+            <w:tcW w:type="dxa" w:w="4680"/>
+          </w:tcPr>
+          <w:p>
+            <w:r>
+              <w:rPr>
+                <w:b/>
+                <w:sz w:val="21"/>
+              </w:rPr>
+              <w:t>Test Case ID</w:t>
+            </w:r>
+          </w:p>
+        </w:tc>
+        <w:tc>
+          <w:tcPr>
+            <w:tcW w:type="dxa" w:w="4680"/>
+          </w:tcPr>
+          <w:p>
+            <w:r>
+              <w:rPr>
+                <w:b w:val="0"/>
+                <w:sz w:val="21"/>
+              </w:rPr>
+              <w:t>BE-CT-01</w:t>
+            </w:r>
+          </w:p>
+        </w:tc>
+      </w:tr>
+      <w:tr>
+        <w:tc>
+          <w:tcPr>
+            <w:tcW w:type="dxa" w:w="4680"/>
+          </w:tcPr>
+          <w:p>
+            <w:r>
+              <w:rPr>
+                <w:b/>
+                <w:sz w:val="21"/>
+              </w:rPr>
+              <w:t>Test Type</w:t>
+            </w:r>
+          </w:p>
+        </w:tc>
+        <w:tc>
+          <w:tcPr>
+            <w:tcW w:type="dxa" w:w="4680"/>
+          </w:tcPr>
+          <w:p>
+            <w:r>
+              <w:rPr>
+                <w:b w:val="0"/>
+                <w:sz w:val="21"/>
+              </w:rPr>
+              <w:t>Integration Testing / Configuration Testing</w:t>
+            </w:r>
+          </w:p>
+        </w:tc>
+      </w:tr>
+      <w:tr>
+        <w:tc>
+          <w:tcPr>
+            <w:tcW w:type="dxa" w:w="4680"/>
+          </w:tcPr>
+          <w:p>
+            <w:r>
+              <w:rPr>
+                <w:b/>
+                <w:sz w:val="21"/>
+              </w:rPr>
+              <w:t>Component</w:t>
+            </w:r>
+          </w:p>
+        </w:tc>
+        <w:tc>
+          <w:tcPr>
+            <w:tcW w:type="dxa" w:w="4680"/>
+          </w:tcPr>
+          <w:p>
+            <w:r>
+              <w:rPr>
+                <w:b w:val="0"/>
+                <w:sz w:val="21"/>
+              </w:rPr>
+              <w:t>src/config/environmentConfig.mjs</w:t>
+            </w:r>
+          </w:p>
+        </w:tc>
+      </w:tr>
+      <w:tr>
+        <w:tc>
+          <w:tcPr>
+            <w:tcW w:type="dxa" w:w="4680"/>
+          </w:tcPr>
+          <w:p>
+            <w:r>
+              <w:rPr>
+                <w:b/>
+                <w:sz w:val="21"/>
+              </w:rPr>
+              <w:t>Description</w:t>
+            </w:r>
+          </w:p>
+        </w:tc>
+        <w:tc>
+          <w:tcPr>
+            <w:tcW w:type="dxa" w:w="4680"/>
+          </w:tcPr>
+          <w:p>
+            <w:r>
+              <w:rPr>
+                <w:b w:val="0"/>
+                <w:sz w:val="21"/>
+              </w:rPr>
+              <w:t>Verify that the environmentConfig module correctly parses the ALLOWED_ORIGINS environment variable and exposes it as an array.</w:t>
+            </w:r>
+          </w:p>
+        </w:tc>
+      </w:tr>
+      <w:tr>
+        <w:tc>
+          <w:tcPr>
+            <w:tcW w:type="dxa" w:w="4680"/>
+          </w:tcPr>
+          <w:p>
+            <w:r>
+              <w:rPr>
+                <w:b/>
+                <w:sz w:val="21"/>
+              </w:rPr>
+              <w:t>Preconditions</w:t>
+            </w:r>
+          </w:p>
+        </w:tc>
+        <w:tc>
+          <w:tcPr>
+            <w:tcW w:type="dxa" w:w="4680"/>
+          </w:tcPr>
+          <w:p>
+            <w:r>
+              <w:rPr>
+                <w:b w:val="0"/>
+                <w:sz w:val="21"/>
+              </w:rPr>
+              <w:t>ALLOWED_ORIGINS environment variable is set. The environmentConfig module is imported.</w:t>
+            </w:r>
+          </w:p>
+        </w:tc>
+      </w:tr>
+      <w:tr>
+        <w:tc>
+          <w:tcPr>
+            <w:tcW w:type="dxa" w:w="4680"/>
+          </w:tcPr>
+          <w:p>
+            <w:r>
+              <w:rPr>
+                <w:b/>
+                <w:sz w:val="21"/>
+              </w:rPr>
+              <w:t>Expected Result</w:t>
+            </w:r>
+          </w:p>
+        </w:tc>
+        <w:tc>
+          <w:tcPr>
+            <w:tcW w:type="dxa" w:w="4680"/>
+          </w:tcPr>
+          <w:p>
+            <w:r>
+              <w:rPr>
+                <w:b w:val="0"/>
+                <w:sz w:val="21"/>
+              </w:rPr>
+              <w:t>The allowedOrigins property is an array.</w:t>
+            </w:r>
+          </w:p>
+        </w:tc>
+      </w:tr>
+      <w:tr>
+        <w:tc>
+          <w:tcPr>
+            <w:tcW w:type="dxa" w:w="4680"/>
+          </w:tcPr>
+          <w:p>
+            <w:r>
+              <w:rPr>
+                <w:b/>
+                <w:sz w:val="21"/>
+              </w:rPr>
+              <w:t>Actual Result</w:t>
+            </w:r>
+          </w:p>
+        </w:tc>
+        <w:tc>
+          <w:tcPr>
+            <w:tcW w:type="dxa" w:w="4680"/>
+          </w:tcPr>
+          <w:p>
+            <w:r>
+              <w:rPr>
+                <w:b w:val="0"/>
+                <w:sz w:val="21"/>
+              </w:rPr>
+              <w:t>allowedOrigins was confirmed to be an array.</w:t>
+            </w:r>
+          </w:p>
+        </w:tc>
+      </w:tr>
+      <w:tr>
+        <w:tc>
+          <w:tcPr>
+            <w:tcW w:type="dxa" w:w="4680"/>
+          </w:tcPr>
+          <w:p>
+            <w:r>
+              <w:rPr>
+                <w:b/>
+                <w:sz w:val="21"/>
+              </w:rPr>
+              <w:t>Status</w:t>
+            </w:r>
+          </w:p>
+        </w:tc>
+        <w:tc>
+          <w:tcPr>
+            <w:tcW w:type="dxa" w:w="4680"/>
+          </w:tcPr>
+          <w:p>
+            <w:r>
+              <w:rPr>
+                <w:b w:val="0"/>
+                <w:sz w:val="21"/>
+              </w:rPr>
+              <w:t>Pass</w:t>
+            </w:r>
+          </w:p>
+        </w:tc>
+      </w:tr>
+    </w:tbl>
+    <w:p/>
+    <w:tbl>
+      <w:tblPr>
+        <w:tblStyle w:val="TableGrid"/>
+        <w:tblW w:type="auto" w:w="0"/>
+        <w:tblLook w:firstColumn="1" w:firstRow="1" w:lastColumn="0" w:lastRow="0" w:noHBand="0" w:noVBand="1" w:val="04A0"/>
+      </w:tblPr>
+      <w:tblGrid>
+        <w:gridCol w:w="4680"/>
+        <w:gridCol w:w="4680"/>
+      </w:tblGrid>
+      <w:tr>
+        <w:tc>
+          <w:tcPr>
+            <w:tcW w:type="dxa" w:w="4680"/>
+          </w:tcPr>
+          <w:p>
+            <w:r>
+              <w:rPr>
+                <w:b/>
+                <w:sz w:val="21"/>
+              </w:rPr>
+              <w:t>Test Case ID</w:t>
+            </w:r>
+          </w:p>
+        </w:tc>
+        <w:tc>
+          <w:tcPr>
+            <w:tcW w:type="dxa" w:w="4680"/>
+          </w:tcPr>
+          <w:p>
+            <w:r>
+              <w:rPr>
+                <w:b w:val="0"/>
+                <w:sz w:val="21"/>
+              </w:rPr>
+              <w:t>BE-CT-02</w:t>
+            </w:r>
+          </w:p>
+        </w:tc>
+      </w:tr>
+      <w:tr>
+        <w:tc>
+          <w:tcPr>
+            <w:tcW w:type="dxa" w:w="4680"/>
+          </w:tcPr>
+          <w:p>
+            <w:r>
+              <w:rPr>
+                <w:b/>
+                <w:sz w:val="21"/>
+              </w:rPr>
+              <w:t>Test Type</w:t>
+            </w:r>
+          </w:p>
+        </w:tc>
+        <w:tc>
+          <w:tcPr>
+            <w:tcW w:type="dxa" w:w="4680"/>
+          </w:tcPr>
+          <w:p>
+            <w:r>
+              <w:rPr>
+                <w:b w:val="0"/>
+                <w:sz w:val="21"/>
+              </w:rPr>
+              <w:t>Integration Testing / Configuration Testing</w:t>
+            </w:r>
+          </w:p>
+        </w:tc>
+      </w:tr>
+      <w:tr>
+        <w:tc>
+          <w:tcPr>
+            <w:tcW w:type="dxa" w:w="4680"/>
+          </w:tcPr>
+          <w:p>
+            <w:r>
+              <w:rPr>
+                <w:b/>
+                <w:sz w:val="21"/>
+              </w:rPr>
+              <w:t>Component</w:t>
+            </w:r>
+          </w:p>
+        </w:tc>
+        <w:tc>
+          <w:tcPr>
+            <w:tcW w:type="dxa" w:w="4680"/>
+          </w:tcPr>
+          <w:p>
+            <w:r>
+              <w:rPr>
+                <w:b w:val="0"/>
+                <w:sz w:val="21"/>
+              </w:rPr>
+              <w:t>src/server.mjs (CORS middleware configuration)</w:t>
+            </w:r>
+          </w:p>
+        </w:tc>
+      </w:tr>
+      <w:tr>
+        <w:tc>
+          <w:tcPr>
+            <w:tcW w:type="dxa" w:w="4680"/>
+          </w:tcPr>
+          <w:p>
+            <w:r>
+              <w:rPr>
+                <w:b/>
+                <w:sz w:val="21"/>
+              </w:rPr>
+              <w:t>Description</w:t>
+            </w:r>
+          </w:p>
+        </w:tc>
+        <w:tc>
+          <w:tcPr>
+            <w:tcW w:type="dxa" w:w="4680"/>
+          </w:tcPr>
+          <w:p>
+            <w:r>
+              <w:rPr>
+                <w:b w:val="0"/>
+                <w:sz w:val="21"/>
+              </w:rPr>
+              <w:t>Verify that the CORS middleware returns correct headers for a request from an allowed origin, including credentials support.</w:t>
+            </w:r>
+          </w:p>
+        </w:tc>
+      </w:tr>
+      <w:tr>
+        <w:tc>
+          <w:tcPr>
+            <w:tcW w:type="dxa" w:w="4680"/>
+          </w:tcPr>
+          <w:p>
+            <w:r>
+              <w:rPr>
+                <w:b/>
+                <w:sz w:val="21"/>
+              </w:rPr>
+              <w:t>Preconditions</w:t>
+            </w:r>
+          </w:p>
+        </w:tc>
+        <w:tc>
+          <w:tcPr>
+            <w:tcW w:type="dxa" w:w="4680"/>
+          </w:tcPr>
+          <w:p>
+            <w:r>
+              <w:rPr>
+                <w:b w:val="0"/>
+                <w:sz w:val="21"/>
+              </w:rPr>
+              <w:t>Express app is configured with a restricted list of allowed origins. Request is sent from an allowed origin.</w:t>
+            </w:r>
+          </w:p>
+        </w:tc>
+      </w:tr>
+      <w:tr>
+        <w:tc>
+          <w:tcPr>
+            <w:tcW w:type="dxa" w:w="4680"/>
+          </w:tcPr>
+          <w:p>
+            <w:r>
+              <w:rPr>
+                <w:b/>
+                <w:sz w:val="21"/>
+              </w:rPr>
+              <w:t>Expected Result</w:t>
+            </w:r>
+          </w:p>
+        </w:tc>
+        <w:tc>
+          <w:tcPr>
+            <w:tcW w:type="dxa" w:w="4680"/>
+          </w:tcPr>
+          <w:p>
+            <w:r>
+              <w:rPr>
+                <w:b w:val="0"/>
+                <w:sz w:val="21"/>
+              </w:rPr>
+              <w:t>Response includes Access-Control-Allow-Origin matching the request origin and Access-Control-Allow-Credentials set to true.</w:t>
+            </w:r>
+          </w:p>
+        </w:tc>
+      </w:tr>
+      <w:tr>
+        <w:tc>
+          <w:tcPr>
+            <w:tcW w:type="dxa" w:w="4680"/>
+          </w:tcPr>
+          <w:p>
+            <w:r>
+              <w:rPr>
+                <w:b/>
+                <w:sz w:val="21"/>
+              </w:rPr>
+              <w:t>Actual Result</w:t>
+            </w:r>
+          </w:p>
+        </w:tc>
+        <w:tc>
+          <w:tcPr>
+            <w:tcW w:type="dxa" w:w="4680"/>
+          </w:tcPr>
+          <w:p>
+            <w:r>
+              <w:rPr>
+                <w:b w:val="0"/>
+                <w:sz w:val="21"/>
+              </w:rPr>
+              <w:t>Response correctly included Access-Control-Allow-Origin set to the allowed origin and credentials header set to true.</w:t>
+            </w:r>
+          </w:p>
+        </w:tc>
+      </w:tr>
+      <w:tr>
+        <w:tc>
+          <w:tcPr>
+            <w:tcW w:type="dxa" w:w="4680"/>
+          </w:tcPr>
+          <w:p>
+            <w:r>
+              <w:rPr>
+                <w:b/>
+                <w:sz w:val="21"/>
+              </w:rPr>
+              <w:t>Status</w:t>
+            </w:r>
+          </w:p>
+        </w:tc>
+        <w:tc>
+          <w:tcPr>
+            <w:tcW w:type="dxa" w:w="4680"/>
+          </w:tcPr>
+          <w:p>
+            <w:r>
+              <w:rPr>
+                <w:b w:val="0"/>
+                <w:sz w:val="21"/>
+              </w:rPr>
+              <w:t>Pass</w:t>
+            </w:r>
+          </w:p>
+        </w:tc>
+      </w:tr>
+    </w:tbl>
+    <w:p/>
+    <w:tbl>
+      <w:tblPr>
+        <w:tblStyle w:val="TableGrid"/>
+        <w:tblW w:type="auto" w:w="0"/>
+        <w:tblLook w:firstColumn="1" w:firstRow="1" w:lastColumn="0" w:lastRow="0" w:noHBand="0" w:noVBand="1" w:val="04A0"/>
+      </w:tblPr>
+      <w:tblGrid>
+        <w:gridCol w:w="4680"/>
+        <w:gridCol w:w="4680"/>
+      </w:tblGrid>
+      <w:tr>
+        <w:tc>
+          <w:tcPr>
+            <w:tcW w:type="dxa" w:w="4680"/>
+          </w:tcPr>
+          <w:p>
+            <w:r>
+              <w:rPr>
+                <w:b/>
+                <w:sz w:val="21"/>
+              </w:rPr>
+              <w:t>Test Case ID</w:t>
+            </w:r>
+          </w:p>
+        </w:tc>
+        <w:tc>
+          <w:tcPr>
+            <w:tcW w:type="dxa" w:w="4680"/>
+          </w:tcPr>
+          <w:p>
+            <w:r>
+              <w:rPr>
+                <w:b w:val="0"/>
+                <w:sz w:val="21"/>
+              </w:rPr>
+              <w:t>BE-CT-03</w:t>
+            </w:r>
+          </w:p>
+        </w:tc>
+      </w:tr>
+      <w:tr>
+        <w:tc>
+          <w:tcPr>
+            <w:tcW w:type="dxa" w:w="4680"/>
+          </w:tcPr>
+          <w:p>
+            <w:r>
+              <w:rPr>
+                <w:b/>
+                <w:sz w:val="21"/>
+              </w:rPr>
+              <w:t>Test Type</w:t>
+            </w:r>
+          </w:p>
+        </w:tc>
+        <w:tc>
+          <w:tcPr>
+            <w:tcW w:type="dxa" w:w="4680"/>
+          </w:tcPr>
+          <w:p>
+            <w:r>
+              <w:rPr>
+                <w:b w:val="0"/>
+                <w:sz w:val="21"/>
+              </w:rPr>
+              <w:t>Integration Testing / Configuration Testing</w:t>
+            </w:r>
+          </w:p>
+        </w:tc>
+      </w:tr>
+      <w:tr>
+        <w:tc>
+          <w:tcPr>
+            <w:tcW w:type="dxa" w:w="4680"/>
+          </w:tcPr>
+          <w:p>
+            <w:r>
+              <w:rPr>
+                <w:b/>
+                <w:sz w:val="21"/>
+              </w:rPr>
+              <w:t>Component</w:t>
+            </w:r>
+          </w:p>
+        </w:tc>
+        <w:tc>
+          <w:tcPr>
+            <w:tcW w:type="dxa" w:w="4680"/>
+          </w:tcPr>
+          <w:p>
+            <w:r>
+              <w:rPr>
+                <w:b w:val="0"/>
+                <w:sz w:val="21"/>
+              </w:rPr>
+              <w:t>src/server.mjs (CORS middleware configuration)</w:t>
+            </w:r>
+          </w:p>
+        </w:tc>
+      </w:tr>
+      <w:tr>
+        <w:tc>
+          <w:tcPr>
+            <w:tcW w:type="dxa" w:w="4680"/>
+          </w:tcPr>
+          <w:p>
+            <w:r>
+              <w:rPr>
+                <w:b/>
+                <w:sz w:val="21"/>
+              </w:rPr>
+              <w:t>Description</w:t>
+            </w:r>
+          </w:p>
+        </w:tc>
+        <w:tc>
+          <w:tcPr>
+            <w:tcW w:type="dxa" w:w="4680"/>
+          </w:tcPr>
+          <w:p>
+            <w:r>
+              <w:rPr>
+                <w:b w:val="0"/>
+                <w:sz w:val="21"/>
+              </w:rPr>
+              <w:t>Verify that the CORS middleware does not return CORS headers for requests from disallowed origins.</w:t>
+            </w:r>
+          </w:p>
+        </w:tc>
+      </w:tr>
+      <w:tr>
+        <w:tc>
+          <w:tcPr>
+            <w:tcW w:type="dxa" w:w="4680"/>
+          </w:tcPr>
+          <w:p>
+            <w:r>
+              <w:rPr>
+                <w:b/>
+                <w:sz w:val="21"/>
+              </w:rPr>
+              <w:t>Preconditions</w:t>
+            </w:r>
+          </w:p>
+        </w:tc>
+        <w:tc>
+          <w:tcPr>
+            <w:tcW w:type="dxa" w:w="4680"/>
+          </w:tcPr>
+          <w:p>
+            <w:r>
+              <w:rPr>
+                <w:b w:val="0"/>
+                <w:sz w:val="21"/>
+              </w:rPr>
+              <w:t>Express app is configured with a restricted list of allowed origins. Request is sent from a disallowed origin.</w:t>
+            </w:r>
+          </w:p>
+        </w:tc>
+      </w:tr>
+      <w:tr>
+        <w:tc>
+          <w:tcPr>
+            <w:tcW w:type="dxa" w:w="4680"/>
+          </w:tcPr>
+          <w:p>
+            <w:r>
+              <w:rPr>
+                <w:b/>
+                <w:sz w:val="21"/>
+              </w:rPr>
+              <w:t>Expected Result</w:t>
+            </w:r>
+          </w:p>
+        </w:tc>
+        <w:tc>
+          <w:tcPr>
+            <w:tcW w:type="dxa" w:w="4680"/>
+          </w:tcPr>
+          <w:p>
+            <w:r>
+              <w:rPr>
+                <w:b w:val="0"/>
+                <w:sz w:val="21"/>
+              </w:rPr>
+              <w:t>Response does not include an Access-Control-Allow-Origin header.</w:t>
+            </w:r>
+          </w:p>
+        </w:tc>
+      </w:tr>
+      <w:tr>
+        <w:tc>
+          <w:tcPr>
+            <w:tcW w:type="dxa" w:w="4680"/>
+          </w:tcPr>
+          <w:p>
+            <w:r>
+              <w:rPr>
+                <w:b/>
+                <w:sz w:val="21"/>
+              </w:rPr>
+              <w:t>Actual Result</w:t>
+            </w:r>
+          </w:p>
+        </w:tc>
+        <w:tc>
+          <w:tcPr>
+            <w:tcW w:type="dxa" w:w="4680"/>
+          </w:tcPr>
+          <w:p>
+            <w:r>
+              <w:rPr>
+                <w:b w:val="0"/>
+                <w:sz w:val="21"/>
+              </w:rPr>
+              <w:t>Response contained no Access-Control-Allow-Origin header for the disallowed origin.</w:t>
+            </w:r>
+          </w:p>
+        </w:tc>
+      </w:tr>
+      <w:tr>
+        <w:tc>
+          <w:tcPr>
+            <w:tcW w:type="dxa" w:w="4680"/>
+          </w:tcPr>
+          <w:p>
+            <w:r>
+              <w:rPr>
+                <w:b/>
+                <w:sz w:val="21"/>
+              </w:rPr>
+              <w:t>Status</w:t>
+            </w:r>
+          </w:p>
+        </w:tc>
+        <w:tc>
+          <w:tcPr>
+            <w:tcW w:type="dxa" w:w="4680"/>
+          </w:tcPr>
+          <w:p>
+            <w:r>
+              <w:rPr>
+                <w:b w:val="0"/>
+                <w:sz w:val="21"/>
+              </w:rPr>
+              <w:t>Pass</w:t>
+            </w:r>
+          </w:p>
+        </w:tc>
+      </w:tr>
+    </w:tbl>
+    <w:p/>
+    <w:tbl>
+      <w:tblPr>
+        <w:tblStyle w:val="TableGrid"/>
+        <w:tblW w:type="auto" w:w="0"/>
+        <w:tblLook w:firstColumn="1" w:firstRow="1" w:lastColumn="0" w:lastRow="0" w:noHBand="0" w:noVBand="1" w:val="04A0"/>
+      </w:tblPr>
+      <w:tblGrid>
+        <w:gridCol w:w="4680"/>
+        <w:gridCol w:w="4680"/>
+      </w:tblGrid>
+      <w:tr>
+        <w:tc>
+          <w:tcPr>
+            <w:tcW w:type="dxa" w:w="4680"/>
+          </w:tcPr>
+          <w:p>
+            <w:r>
+              <w:rPr>
+                <w:b/>
+                <w:sz w:val="21"/>
+              </w:rPr>
+              <w:t>Test Case ID</w:t>
+            </w:r>
+          </w:p>
+        </w:tc>
+        <w:tc>
+          <w:tcPr>
+            <w:tcW w:type="dxa" w:w="4680"/>
+          </w:tcPr>
+          <w:p>
+            <w:r>
+              <w:rPr>
+                <w:b w:val="0"/>
+                <w:sz w:val="21"/>
+              </w:rPr>
+              <w:t>BE-CT-04</w:t>
+            </w:r>
+          </w:p>
+        </w:tc>
+      </w:tr>
+      <w:tr>
+        <w:tc>
+          <w:tcPr>
+            <w:tcW w:type="dxa" w:w="4680"/>
+          </w:tcPr>
+          <w:p>
+            <w:r>
+              <w:rPr>
+                <w:b/>
+                <w:sz w:val="21"/>
+              </w:rPr>
+              <w:t>Test Type</w:t>
+            </w:r>
+          </w:p>
+        </w:tc>
+        <w:tc>
+          <w:tcPr>
+            <w:tcW w:type="dxa" w:w="4680"/>
+          </w:tcPr>
+          <w:p>
+            <w:r>
+              <w:rPr>
+                <w:b w:val="0"/>
+                <w:sz w:val="21"/>
+              </w:rPr>
+              <w:t>Integration Testing / Configuration Testing</w:t>
+            </w:r>
+          </w:p>
+        </w:tc>
+      </w:tr>
+      <w:tr>
+        <w:tc>
+          <w:tcPr>
+            <w:tcW w:type="dxa" w:w="4680"/>
+          </w:tcPr>
+          <w:p>
+            <w:r>
+              <w:rPr>
+                <w:b/>
+                <w:sz w:val="21"/>
+              </w:rPr>
+              <w:t>Component</w:t>
+            </w:r>
+          </w:p>
+        </w:tc>
+        <w:tc>
+          <w:tcPr>
+            <w:tcW w:type="dxa" w:w="4680"/>
+          </w:tcPr>
+          <w:p>
+            <w:r>
+              <w:rPr>
+                <w:b w:val="0"/>
+                <w:sz w:val="21"/>
+              </w:rPr>
+              <w:t>src/server.mjs (CORS middleware configuration)</w:t>
+            </w:r>
+          </w:p>
+        </w:tc>
+      </w:tr>
+      <w:tr>
+        <w:tc>
+          <w:tcPr>
+            <w:tcW w:type="dxa" w:w="4680"/>
+          </w:tcPr>
+          <w:p>
+            <w:r>
+              <w:rPr>
+                <w:b/>
+                <w:sz w:val="21"/>
+              </w:rPr>
+              <w:t>Description</w:t>
+            </w:r>
+          </w:p>
+        </w:tc>
+        <w:tc>
+          <w:tcPr>
+            <w:tcW w:type="dxa" w:w="4680"/>
+          </w:tcPr>
+          <w:p>
+            <w:r>
+              <w:rPr>
+                <w:b w:val="0"/>
+                <w:sz w:val="21"/>
+              </w:rPr>
+              <w:t>Verify that wildcard CORS configuration allows requests from any origin without setting credentials headers.</w:t>
+            </w:r>
+          </w:p>
+        </w:tc>
+      </w:tr>
+      <w:tr>
+        <w:tc>
+          <w:tcPr>
+            <w:tcW w:type="dxa" w:w="4680"/>
+          </w:tcPr>
+          <w:p>
+            <w:r>
+              <w:rPr>
+                <w:b/>
+                <w:sz w:val="21"/>
+              </w:rPr>
+              <w:t>Preconditions</w:t>
+            </w:r>
+          </w:p>
+        </w:tc>
+        <w:tc>
+          <w:tcPr>
+            <w:tcW w:type="dxa" w:w="4680"/>
+          </w:tcPr>
+          <w:p>
+            <w:r>
+              <w:rPr>
+                <w:b w:val="0"/>
+                <w:sz w:val="21"/>
+              </w:rPr>
+              <w:t>Express app is configured with wildcard CORS (origin: "*"). Request is sent from any arbitrary origin.</w:t>
+            </w:r>
+          </w:p>
+        </w:tc>
+      </w:tr>
+      <w:tr>
+        <w:tc>
+          <w:tcPr>
+            <w:tcW w:type="dxa" w:w="4680"/>
+          </w:tcPr>
+          <w:p>
+            <w:r>
+              <w:rPr>
+                <w:b/>
+                <w:sz w:val="21"/>
+              </w:rPr>
+              <w:t>Expected Result</w:t>
+            </w:r>
+          </w:p>
+        </w:tc>
+        <w:tc>
+          <w:tcPr>
+            <w:tcW w:type="dxa" w:w="4680"/>
+          </w:tcPr>
+          <w:p>
+            <w:r>
+              <w:rPr>
+                <w:b w:val="0"/>
+                <w:sz w:val="21"/>
+              </w:rPr>
+              <w:t>Response includes Access-Control-Allow-Origin set to * and does not include Access-Control-Allow-Credentials.</w:t>
+            </w:r>
+          </w:p>
+        </w:tc>
+      </w:tr>
+      <w:tr>
+        <w:tc>
+          <w:tcPr>
+            <w:tcW w:type="dxa" w:w="4680"/>
+          </w:tcPr>
+          <w:p>
+            <w:r>
+              <w:rPr>
+                <w:b/>
+                <w:sz w:val="21"/>
+              </w:rPr>
+              <w:t>Actual Result</w:t>
+            </w:r>
+          </w:p>
+        </w:tc>
+        <w:tc>
+          <w:tcPr>
+            <w:tcW w:type="dxa" w:w="4680"/>
+          </w:tcPr>
+          <w:p>
+            <w:r>
+              <w:rPr>
+                <w:b w:val="0"/>
+                <w:sz w:val="21"/>
+              </w:rPr>
+              <w:t>Response correctly returned Access-Control-Allow-Origin: * without a credentials header.</w:t>
+            </w:r>
+          </w:p>
+        </w:tc>
+      </w:tr>
+      <w:tr>
+        <w:tc>
+          <w:tcPr>
+            <w:tcW w:type="dxa" w:w="4680"/>
+          </w:tcPr>
+          <w:p>
+            <w:r>
+              <w:rPr>
+                <w:b/>
+                <w:sz w:val="21"/>
+              </w:rPr>
+              <w:t>Status</w:t>
+            </w:r>
+          </w:p>
+        </w:tc>
+        <w:tc>
+          <w:tcPr>
+            <w:tcW w:type="dxa" w:w="4680"/>
+          </w:tcPr>
+          <w:p>
+            <w:r>
+              <w:rPr>
+                <w:b w:val="0"/>
+                <w:sz w:val="21"/>
+              </w:rPr>
+              <w:t>Pass</w:t>
+            </w:r>
+          </w:p>
+        </w:tc>
+      </w:tr>
+    </w:tbl>
     <w:p>
       <w:pPr>
         <w:spacing w:beforeAutospacing="1" w:after="0" w:afterAutospacing="1" w:line="240" w:lineRule="auto"/>
@@ -27124,38 +30176,8 @@
         </w:rPr>
       </w:pPr>
       <w:r>
-        <w:rPr>
-          <w:rFonts w:ascii="Segoe UI" w:hAnsi="Segoe UI" w:cs="Segoe UI"/>
-          <w:sz w:val="21"/>
-          <w:szCs w:val="21"/>
-        </w:rPr>
-        <w:t xml:space="preserve">Additionally, testing efforts were conducted on the </w:t>
-      </w:r>
-      <w:proofErr w:type="gramStart"/>
-      <w:r>
-        <w:rPr>
-          <w:rFonts w:ascii="Segoe UI" w:hAnsi="Segoe UI" w:cs="Segoe UI"/>
-          <w:sz w:val="21"/>
-          <w:szCs w:val="21"/>
-        </w:rPr>
-        <w:t>frontend</w:t>
-      </w:r>
-      <w:proofErr w:type="gramEnd"/>
-      <w:r>
-        <w:rPr>
-          <w:rFonts w:ascii="Segoe UI" w:hAnsi="Segoe UI" w:cs="Segoe UI"/>
-          <w:sz w:val="21"/>
-          <w:szCs w:val="21"/>
-        </w:rPr>
-        <w:t xml:space="preserve"> to validate functionality, responsiveness, and navigation, with further testing planned once full system integration is achieved.</w:t>
-      </w:r>
-      <w:r>
-        <w:rPr>
-          <w:rFonts w:ascii="Segoe UI" w:hAnsi="Segoe UI" w:cs="Segoe UI"/>
-          <w:sz w:val="21"/>
-          <w:szCs w:val="21"/>
-        </w:rPr>
-        <w:t xml:space="preserve"> …</w:t>
+        <w:rPr/>
+        <w:t>Additionally, testing efforts were conducted across both the frontend and backend to validate functionality, security, and integration. Frontend testing covered UI responsiveness and navigation, while backend testing employed automated integration tests to verify REST API authentication, session management, real-time Socket.IO communication, and CORS configuration. All backend test cases passed, confirming the server handles both valid and invalid inputs correctly and that security controls such as API key enforcement and ticket ID validation behave as intended.</w:t>
       </w:r>
     </w:p>
     <w:p>

</xml_diff>